<commit_message>
docs: update execution evidence report
</commit_message>
<xml_diff>
--- a/docs/Execution_Evidence_Report.docx
+++ b/docs/Execution_Evidence_Report.docx
@@ -1,6 +1,6 @@
 
 <file path=word/document.xml><?xml version="1.0" encoding="utf-8"?>
-<w:document xmlns:wpc="http://schemas.microsoft.com/office/word/2010/wordprocessingCanvas" xmlns:mo="http://schemas.microsoft.com/office/mac/office/2008/main" xmlns:mc="http://schemas.openxmlformats.org/markup-compatibility/2006" xmlns:mv="urn:schemas-microsoft-com:mac:vml" xmlns:o="urn:schemas-microsoft-com:office:office" xmlns:r="http://schemas.openxmlformats.org/officeDocument/2006/relationships" xmlns:m="http://schemas.openxmlformats.org/officeDocument/2006/math" xmlns:v="urn:schemas-microsoft-com:vml" xmlns:wp14="http://schemas.microsoft.com/office/word/2010/wordprocessingDrawing" xmlns:wp="http://schemas.openxmlformats.org/drawingml/2006/wordprocessingDrawing" xmlns:w10="urn:schemas-microsoft-com:office:word" xmlns:w="http://schemas.openxmlformats.org/wordprocessingml/2006/main" xmlns:w14="http://schemas.microsoft.com/office/word/2010/wordml" xmlns:wpg="http://schemas.microsoft.com/office/word/2010/wordprocessingGroup" xmlns:wpi="http://schemas.microsoft.com/office/word/2010/wordprocessingInk" xmlns:wne="http://schemas.microsoft.com/office/word/2006/wordml" xmlns:wps="http://schemas.microsoft.com/office/word/2010/wordprocessingShape" mc:Ignorable="w14 wp14">
+<w:document xmlns:ns1="http://schemas.openxmlformats.org/markup-compatibility/2006" xmlns:ns2="http://schemas.openxmlformats.org/drawingml/2006/wordprocessingDrawing" xmlns:ns3="http://schemas.openxmlformats.org/drawingml/2006/main" xmlns:ns4="http://schemas.openxmlformats.org/drawingml/2006/picture" xmlns:ns5="http://schemas.openxmlformats.org/officeDocument/2006/relationships" xmlns:w="http://schemas.openxmlformats.org/wordprocessingml/2006/main" ns1:Ignorable="w14 wp14">
   <w:body>
     <w:p>
       <w:pPr>
@@ -350,7 +350,7 @@
           <w:i w:val="0"/>
           <w:sz w:val="24"/>
         </w:rPr>
-        <w:t>This report consolidates execution artifacts checked into the StratifyAI repository and records what each artifact supports. The dated evidence includes a full test run with 197 passing tests, 13 of 13 scripted service workflows passing, 60 of 60 role/action authorization decisions matching the permission registry, ten poisoned-name payloads excluded from Copilot evidence, and audit-chain tampering detected at entry 1. The repository progress note separately records a later full-tree check of 205 tests on 20 October 2026. Since the reviewed evidence artifacts do not include that later console transcript, both counts are reported with their provenance rather than merged.</w:t>
+        <w:t>This report consolidates checked-in execution artifacts and states what each supports. Recorded evidence includes 197 passing tests, 13 of 13 scripted service workflows, 60 role/action decisions matching the permission registry, ten poisoned-name payloads excluded from Copilot evidence, and audit-chain tampering detected at entry 1. The repository also contains signed-in screenshots of synthetic-data workflows and the public Overview.</w:t>
       </w:r>
     </w:p>
     <w:p>
@@ -364,7 +364,7 @@
           <w:i w:val="0"/>
           <w:sz w:val="24"/>
         </w:rPr>
-        <w:t>The evaluation also records adverse product evidence. Across all five synthetic holdout cases, StratifyAI has higher MAE than the naive last-four-week mean baseline. Only one of five selected plans maintained the configured reserve. These results are limitations, not evidence of forecast accuracy or improved decisions. The repository contains a current public Overview capture and a historical design-review image. Eight requested signed-in page captures remain outstanding; the runtime simulated-action log is not checked in.</w:t>
+        <w:t>The evaluation also records adverse product evidence: across all five synthetic holdout cases, forecast MAE is higher than the naive last-four-week mean baseline; one of five selected plans maintained the configured reserve. These results do not support an accuracy or decision-improvement claim. A simulated-action log and demo video are not present in the reviewed tree; scripted service tests and UI screenshots cover selected local workflows.</w:t>
       </w:r>
     </w:p>
     <w:p>
@@ -1333,7 +1333,7 @@
                 <w:color w:val="183A35"/>
                 <w:sz w:val="24"/>
               </w:rPr>
-              <w:t>Public Overview present; 8 captures pending</w:t>
+              <w:t>Signed-in screenshots present; sandbox log/video absent</w:t>
             </w:r>
           </w:p>
         </w:tc>
@@ -1369,7 +1369,7 @@
                 <w:color w:val="183A35"/>
                 <w:sz w:val="24"/>
               </w:rPr>
-              <w:t>Captured public view only</w:t>
+              <w:t>Selected synthetic UI states are visible</w:t>
             </w:r>
           </w:p>
         </w:tc>
@@ -1405,7 +1405,7 @@
                 <w:color w:val="183A35"/>
                 <w:sz w:val="24"/>
               </w:rPr>
-              <w:t>Complete visual verification</w:t>
+              <w:t>Live sandbox execution, full video walkthrough or production validation</w:t>
             </w:r>
           </w:p>
         </w:tc>
@@ -1459,7 +1459,7 @@
           <w:i w:val="0"/>
           <w:sz w:val="24"/>
         </w:rPr>
-        <w:t>Evidence identifiers [E1]–[E8] refer to repository artifacts in Section 7. Results are transcribed from checked-in records or the progress log; this document does not rerun tests or create runtime evidence. A recorded PASS means that the assertion or workflow passed in its stated run, not that the system is secure or ready for real financial decisions.</w:t>
+        <w:t>Evidence identifiers [E1]?[E8] refer to repository artifacts in Section 7. Results are transcribed from checked-in records; this document does not rerun tests or create runtime evidence. A recorded PASS means only that the listed assertion or workflow passed in its stated run.</w:t>
       </w:r>
     </w:p>
     <w:p>
@@ -1489,7 +1489,7 @@
           <w:i w:val="0"/>
           <w:sz w:val="24"/>
         </w:rPr>
-        <w:t>The evidence concerns a local Streamlit prototype using generated synthetic SME cases. Reviewed material includes test output, scripted service workflows, focused security checks, a synthetic holdout backtest, reserve outcomes and limited browser captures. No real customer dataset, lender, bank, payment service or production deployment is represented.</w:t>
+        <w:t>The evidence concerns a Streamlit prototype using generated synthetic SME cases. Reviewed material includes test output, scripted service workflows, focused security checks, a synthetic holdout backtest, reserve outcomes and signed-in browser captures. No real customer dataset, lender, bank, payment service or production deployment is represented.</w:t>
       </w:r>
     </w:p>
     <w:p>
@@ -1503,7 +1503,21 @@
           <w:i w:val="0"/>
           <w:sz w:val="24"/>
         </w:rPr>
-        <w:t>Artifacts were compared with the README, Technical Documentation, Security Self-Assessment and execution evidence index. Dates and counts are retained as recorded. Where a later progress note reports a result without its raw output artifact, it is labeled a secondary checkpoint.</w:t>
+        <w:t>Topic E is non-on-chain. This report therefore uses simulated-account and sandbox evidence; blockchain transaction hashes are not applicable.</w:t>
+      </w:r>
+    </w:p>
+    <w:p>
+      <w:pPr>
+        <w:spacing w:after="120" w:line="259" w:lineRule="auto"/>
+      </w:pPr>
+      <w:r>
+        <w:rPr>
+          <w:rFonts w:ascii="Times New Roman" w:hAnsi="Times New Roman" w:eastAsia="Times New Roman"/>
+          <w:b w:val="0"/>
+          <w:i w:val="0"/>
+          <w:sz w:val="24"/>
+        </w:rPr>
+        <w:t>Artifacts were compared with README.md, Technical Documentation, Security Self-Assessment and the execution evidence index. Dates, counts and caveats are retained as recorded.</w:t>
       </w:r>
     </w:p>
     <w:p>
@@ -2108,7 +2122,7 @@
           <w:i w:val="0"/>
           <w:sz w:val="24"/>
         </w:rPr>
-        <w:t>The checked-in transcript records python -m pytest -q at 2026-10-18 06:57:57 UTC, exit code 0, with 197 tests passing in 43.10 seconds [E1]. The later docs/PROGRESS.md entry states that a full-tree check on 2026-10-20 passed 205 tests, alongside Ruff, health and secret checks. The reviewed evidence directory contains the 197-test transcript but no separate timestamped output for the later 205-test run. Thus 197 is the directly archived run and 205 is a later project checkpoint, not two results from one run.</w:t>
+        <w:t>The checked-in transcript records python -m pytest -q at 2026-10-18 06:57:57 UTC, exit code 0, with 197 tests passing in 43.10 seconds [E1]. This report cites that archived run.</w:t>
       </w:r>
     </w:p>
     <w:tbl>
@@ -2404,152 +2418,6 @@
                 <w:sz w:val="24"/>
               </w:rPr>
               <w:t>Raw text [E1]</w:t>
-            </w:r>
-          </w:p>
-        </w:tc>
-      </w:tr>
-      <w:tr>
-        <w:tc>
-          <w:tcPr>
-            <w:tcW w:type="dxa" w:w="2541"/>
-            <w:shd w:fill="FFFFFF"/>
-            <w:tcBorders>
-              <w:top w:val="single" w:sz="5" w:color="D7E4DD"/>
-              <w:left w:val="single" w:sz="5" w:color="D7E4DD"/>
-              <w:bottom w:val="single" w:sz="5" w:color="D7E4DD"/>
-              <w:right w:val="single" w:sz="5" w:color="D7E4DD"/>
-              <w:insideH w:val="single" w:sz="5" w:color="D7E4DD"/>
-              <w:insideV w:val="single" w:sz="5" w:color="D7E4DD"/>
-            </w:tcBorders>
-            <w:vAlign w:val="center"/>
-          </w:tcPr>
-          <w:p>
-            <w:pPr>
-              <w:spacing w:after="20" w:line="240" w:lineRule="auto"/>
-            </w:pPr>
-            <w:r>
-              <w:rPr>
-                <w:rFonts w:ascii="Times New Roman" w:hAnsi="Times New Roman" w:eastAsia="Times New Roman"/>
-                <w:sz w:val="24"/>
-              </w:rPr>
-            </w:r>
-            <w:r>
-              <w:rPr>
-                <w:rFonts w:ascii="Times New Roman" w:hAnsi="Times New Roman" w:eastAsia="Times New Roman"/>
-                <w:b w:val="0"/>
-                <w:i w:val="0"/>
-                <w:color w:val="183A35"/>
-                <w:sz w:val="24"/>
-              </w:rPr>
-              <w:t>Later full-tree QA</w:t>
-            </w:r>
-          </w:p>
-        </w:tc>
-        <w:tc>
-          <w:tcPr>
-            <w:tcW w:type="dxa" w:w="2541"/>
-            <w:shd w:fill="FFFFFF"/>
-            <w:tcBorders>
-              <w:top w:val="single" w:sz="5" w:color="D7E4DD"/>
-              <w:left w:val="single" w:sz="5" w:color="D7E4DD"/>
-              <w:bottom w:val="single" w:sz="5" w:color="D7E4DD"/>
-              <w:right w:val="single" w:sz="5" w:color="D7E4DD"/>
-              <w:insideH w:val="single" w:sz="5" w:color="D7E4DD"/>
-              <w:insideV w:val="single" w:sz="5" w:color="D7E4DD"/>
-            </w:tcBorders>
-            <w:vAlign w:val="center"/>
-          </w:tcPr>
-          <w:p>
-            <w:pPr>
-              <w:spacing w:after="20" w:line="240" w:lineRule="auto"/>
-            </w:pPr>
-            <w:r>
-              <w:rPr>
-                <w:rFonts w:ascii="Times New Roman" w:hAnsi="Times New Roman" w:eastAsia="Times New Roman"/>
-                <w:sz w:val="24"/>
-              </w:rPr>
-            </w:r>
-            <w:r>
-              <w:rPr>
-                <w:rFonts w:ascii="Times New Roman" w:hAnsi="Times New Roman" w:eastAsia="Times New Roman"/>
-                <w:b w:val="0"/>
-                <w:i w:val="0"/>
-                <w:color w:val="183A35"/>
-                <w:sz w:val="24"/>
-              </w:rPr>
-              <w:t>2026-10-20</w:t>
-            </w:r>
-          </w:p>
-        </w:tc>
-        <w:tc>
-          <w:tcPr>
-            <w:tcW w:type="dxa" w:w="2541"/>
-            <w:shd w:fill="FFFFFF"/>
-            <w:tcBorders>
-              <w:top w:val="single" w:sz="5" w:color="D7E4DD"/>
-              <w:left w:val="single" w:sz="5" w:color="D7E4DD"/>
-              <w:bottom w:val="single" w:sz="5" w:color="D7E4DD"/>
-              <w:right w:val="single" w:sz="5" w:color="D7E4DD"/>
-              <w:insideH w:val="single" w:sz="5" w:color="D7E4DD"/>
-              <w:insideV w:val="single" w:sz="5" w:color="D7E4DD"/>
-            </w:tcBorders>
-            <w:vAlign w:val="center"/>
-          </w:tcPr>
-          <w:p>
-            <w:pPr>
-              <w:spacing w:after="20" w:line="240" w:lineRule="auto"/>
-            </w:pPr>
-            <w:r>
-              <w:rPr>
-                <w:rFonts w:ascii="Times New Roman" w:hAnsi="Times New Roman" w:eastAsia="Times New Roman"/>
-                <w:sz w:val="24"/>
-              </w:rPr>
-            </w:r>
-            <w:r>
-              <w:rPr>
-                <w:rFonts w:ascii="Times New Roman" w:hAnsi="Times New Roman" w:eastAsia="Times New Roman"/>
-                <w:b w:val="0"/>
-                <w:i w:val="0"/>
-                <w:color w:val="183A35"/>
-                <w:sz w:val="24"/>
-              </w:rPr>
-              <w:t>205 passed; Ruff, health, secret scan noted</w:t>
-            </w:r>
-          </w:p>
-        </w:tc>
-        <w:tc>
-          <w:tcPr>
-            <w:tcW w:type="dxa" w:w="2541"/>
-            <w:shd w:fill="FFFFFF"/>
-            <w:tcBorders>
-              <w:top w:val="single" w:sz="5" w:color="D7E4DD"/>
-              <w:left w:val="single" w:sz="5" w:color="D7E4DD"/>
-              <w:bottom w:val="single" w:sz="5" w:color="D7E4DD"/>
-              <w:right w:val="single" w:sz="5" w:color="D7E4DD"/>
-              <w:insideH w:val="single" w:sz="5" w:color="D7E4DD"/>
-              <w:insideV w:val="single" w:sz="5" w:color="D7E4DD"/>
-            </w:tcBorders>
-            <w:vAlign w:val="center"/>
-          </w:tcPr>
-          <w:p>
-            <w:pPr>
-              <w:spacing w:after="20" w:line="240" w:lineRule="auto"/>
-            </w:pPr>
-            <w:r>
-              <w:rPr>
-                <w:rFonts w:ascii="Times New Roman" w:hAnsi="Times New Roman" w:eastAsia="Times New Roman"/>
-                <w:sz w:val="24"/>
-              </w:rPr>
-            </w:r>
-            <w:r>
-              <w:rPr>
-                <w:rFonts w:ascii="Times New Roman" w:hAnsi="Times New Roman" w:eastAsia="Times New Roman"/>
-                <w:b w:val="0"/>
-                <w:i w:val="0"/>
-                <w:color w:val="183A35"/>
-                <w:sz w:val="24"/>
-              </w:rPr>
-              <w:t>Progress summary; separate raw transcript not located</w:t>
             </w:r>
           </w:p>
         </w:tc>
@@ -7487,7 +7355,7 @@
           <w:color w:val="166B52"/>
           <w:sz w:val="24"/>
         </w:rPr>
-        <w:t>5. Interface and run evidence</w:t>
+        <w:t>5. Interface, sandbox and demo evidence</w:t>
       </w:r>
     </w:p>
     <w:p>
@@ -7517,7 +7385,7 @@
           <w:i w:val="0"/>
           <w:sz w:val="24"/>
         </w:rPr>
-        <w:t>The repository includes a 1440-pixel public Overview capture at docs/img/overview.png and an older T02 Overview review image at evidence/t02-overview-review.png [E6]. The first is a public landing view, not a signed-in business dashboard. The latter is historical and must not be presented as current UI evidence.</w:t>
+        <w:t>The repository includes a public Overview capture and signed-in screenshots of synthetic-case workflows under docs/img/ [E6]. The historical T02 Overview image is retained separately as an older design record and is not presented as current UI evidence.</w:t>
       </w:r>
     </w:p>
     <w:p>
@@ -7530,36 +7398,36 @@
           <w:sz w:val="24"/>
         </w:rPr>
         <w:drawing>
-          <wp:inline xmlns:a="http://schemas.openxmlformats.org/drawingml/2006/main" xmlns:pic="http://schemas.openxmlformats.org/drawingml/2006/picture">
-            <wp:extent cx="5669280" cy="4330700"/>
-            <wp:docPr id="1" name="Picture 1"/>
-            <wp:cNvGraphicFramePr>
-              <a:graphicFrameLocks noChangeAspect="1"/>
-            </wp:cNvGraphicFramePr>
-            <a:graphic>
-              <a:graphicData uri="http://schemas.openxmlformats.org/drawingml/2006/picture">
-                <pic:pic>
-                  <pic:nvPicPr>
-                    <pic:cNvPr id="0" name="overview.png"/>
-                    <pic:cNvPicPr/>
-                  </pic:nvPicPr>
-                  <pic:blipFill>
-                    <a:blip r:embed="rId11"/>
-                    <a:stretch>
-                      <a:fillRect/>
-                    </a:stretch>
-                  </pic:blipFill>
-                  <pic:spPr>
-                    <a:xfrm>
-                      <a:off x="0" y="0"/>
-                      <a:ext cx="5669280" cy="4330700"/>
-                    </a:xfrm>
-                    <a:prstGeom prst="rect"/>
-                  </pic:spPr>
-                </pic:pic>
-              </a:graphicData>
-            </a:graphic>
-          </wp:inline>
+          <ns2:inline>
+            <ns2:extent cx="5669280" cy="4330700"/>
+            <ns2:docPr id="1" name="Picture 1"/>
+            <ns2:cNvGraphicFramePr>
+              <ns3:graphicFrameLocks noChangeAspect="1"/>
+            </ns2:cNvGraphicFramePr>
+            <ns3:graphic>
+              <ns3:graphicData uri="http://schemas.openxmlformats.org/drawingml/2006/picture">
+                <ns4:pic>
+                  <ns4:nvPicPr>
+                    <ns4:cNvPr id="0" name="overview.png"/>
+                    <ns4:cNvPicPr/>
+                  </ns4:nvPicPr>
+                  <ns4:blipFill>
+                    <ns3:blip ns5:embed="rId11"/>
+                    <ns3:stretch>
+                      <ns3:fillRect/>
+                    </ns3:stretch>
+                  </ns4:blipFill>
+                  <ns4:spPr>
+                    <ns3:xfrm>
+                      <ns3:off x="0" y="0"/>
+                      <ns3:ext cx="5669280" cy="4330700"/>
+                    </ns3:xfrm>
+                    <ns3:prstGeom prst="rect"/>
+                  </ns4:spPr>
+                </ns4:pic>
+              </ns3:graphicData>
+            </ns3:graphic>
+          </ns2:inline>
         </w:drawing>
       </w:r>
     </w:p>
@@ -7605,36 +7473,36 @@
           <w:sz w:val="24"/>
         </w:rPr>
         <w:drawing>
-          <wp:inline xmlns:a="http://schemas.openxmlformats.org/drawingml/2006/main" xmlns:pic="http://schemas.openxmlformats.org/drawingml/2006/picture">
-            <wp:extent cx="5303520" cy="3776976"/>
-            <wp:docPr id="2" name="Picture 2"/>
-            <wp:cNvGraphicFramePr>
-              <a:graphicFrameLocks noChangeAspect="1"/>
-            </wp:cNvGraphicFramePr>
-            <a:graphic>
-              <a:graphicData uri="http://schemas.openxmlformats.org/drawingml/2006/picture">
-                <pic:pic>
-                  <pic:nvPicPr>
-                    <pic:cNvPr id="0" name="t02-overview-review.png"/>
-                    <pic:cNvPicPr/>
-                  </pic:nvPicPr>
-                  <pic:blipFill>
-                    <a:blip r:embed="rId12"/>
-                    <a:stretch>
-                      <a:fillRect/>
-                    </a:stretch>
-                  </pic:blipFill>
-                  <pic:spPr>
-                    <a:xfrm>
-                      <a:off x="0" y="0"/>
-                      <a:ext cx="5303520" cy="3776976"/>
-                    </a:xfrm>
-                    <a:prstGeom prst="rect"/>
-                  </pic:spPr>
-                </pic:pic>
-              </a:graphicData>
-            </a:graphic>
-          </wp:inline>
+          <ns2:inline>
+            <ns2:extent cx="5303520" cy="3776976"/>
+            <ns2:docPr id="2" name="Picture 2"/>
+            <ns2:cNvGraphicFramePr>
+              <ns3:graphicFrameLocks noChangeAspect="1"/>
+            </ns2:cNvGraphicFramePr>
+            <ns3:graphic>
+              <ns3:graphicData uri="http://schemas.openxmlformats.org/drawingml/2006/picture">
+                <ns4:pic>
+                  <ns4:nvPicPr>
+                    <ns4:cNvPr id="0" name="t02-overview-review.png"/>
+                    <ns4:cNvPicPr/>
+                  </ns4:nvPicPr>
+                  <ns4:blipFill>
+                    <ns3:blip ns5:embed="rId12"/>
+                    <ns3:stretch>
+                      <ns3:fillRect/>
+                    </ns3:stretch>
+                  </ns4:blipFill>
+                  <ns4:spPr>
+                    <ns3:xfrm>
+                      <ns3:off x="0" y="0"/>
+                      <ns3:ext cx="5303520" cy="3776976"/>
+                    </ns3:xfrm>
+                    <ns3:prstGeom prst="rect"/>
+                  </ns4:spPr>
+                </ns4:pic>
+              </ns3:graphicData>
+            </ns3:graphic>
+          </ns2:inline>
         </w:drawing>
       </w:r>
     </w:p>
@@ -7667,7 +7535,7 @@
           <w:color w:val="183A35"/>
           <w:sz w:val="24"/>
         </w:rPr>
-        <w:t>5.2 Required signed-in captures</w:t>
+        <w:t>5.2 Signed-in screenshot exhibits</w:t>
       </w:r>
     </w:p>
     <w:p>
@@ -7681,7 +7549,7 @@
           <w:i w:val="0"/>
           <w:sz w:val="24"/>
         </w:rPr>
-        <w:t>Eight current signed-in page captures remain requested. Capture each at a 1440-pixel viewport after loading a synthetic case. Keep page title, case and synthetic-data label visible. The red-marked slots identify exact insertion locations; replace a slot only after a fresh capture exists and has been visually checked.</w:t>
+        <w:t>Signed-in captures for Cash Flow, Decision Lab, Financing, Analysis, Copilot, Approvals, Upload and Security are embedded below. Supplementary captures for related case, lever, stress, readiness, approval and audit states remain in docs/img/. These are repository images; a separate video recording is not included.</w:t>
       </w:r>
     </w:p>
     <w:p>
@@ -7724,21 +7592,42 @@
             </w:tcBorders>
           </w:tcPr>
           <w:p>
-            <w:r>
-              <w:rPr>
-                <w:rFonts w:ascii="Times New Roman" w:hAnsi="Times New Roman" w:eastAsia="Times New Roman"/>
-                <w:sz w:val="24"/>
-              </w:rPr>
-            </w:r>
-            <w:r>
-              <w:rPr>
-                <w:rFonts w:ascii="Times New Roman" w:hAnsi="Times New Roman" w:eastAsia="Times New Roman"/>
-                <w:b/>
-                <w:i w:val="0"/>
-                <w:color w:val="C00000"/>
-                <w:sz w:val="24"/>
-              </w:rPr>
-              <w:t>[RED — INSERT docs/img/cashflow.png HERE. Capture: Current signed-in cash path with ACTUAL history, FORECAST weeks, reserve line and uncertainty band. Viewport: 1440px. Record case and role in caption. Use a fresh capture; do not substitute historical imagery.]</w:t>
+            <w:pPr>
+              <w:jc val="center"/>
+            </w:pPr>
+            <w:r>
+              <w:drawing>
+                <ns2:inline>
+                  <ns2:extent cx="5577840" cy="4958080"/>
+                  <ns2:docPr id="901" name="cashflow.png" descr="cashflow.png"/>
+                  <ns2:cNvGraphicFramePr>
+                    <ns3:graphicFrameLocks noChangeAspect="1"/>
+                  </ns2:cNvGraphicFramePr>
+                  <ns3:graphic>
+                    <ns3:graphicData uri="http://schemas.openxmlformats.org/drawingml/2006/picture">
+                      <ns4:pic>
+                        <ns4:nvPicPr>
+                          <ns4:cNvPr id="901" name="cashflow.png" descr="cashflow.png"/>
+                          <ns4:cNvPicPr/>
+                        </ns4:nvPicPr>
+                        <ns4:blipFill>
+                          <ns3:blip ns5:embed="rIdExecutionEvidence1"/>
+                          <ns3:stretch>
+                            <ns3:fillRect/>
+                          </ns3:stretch>
+                        </ns4:blipFill>
+                        <ns4:spPr>
+                          <ns3:xfrm>
+                            <ns3:off x="0" y="0"/>
+                            <ns3:ext cx="5577840" cy="4958080"/>
+                          </ns3:xfrm>
+                          <ns3:prstGeom prst="rect"/>
+                        </ns4:spPr>
+                      </ns4:pic>
+                    </ns3:graphicData>
+                  </ns3:graphic>
+                </ns2:inline>
+              </w:drawing>
             </w:r>
           </w:p>
         </w:tc>
@@ -7758,7 +7647,7 @@
           <w:color w:val="596963"/>
           <w:sz w:val="24"/>
         </w:rPr>
-        <w:t>Fig. 4. Cash Flow evidence placeholder. Replace with a fresh signed-in capture and factual caption.</w:t>
+        <w:t>Fig. 4. Signed-in synthetic-case Cash Flow view. Source: docs/img/cashflow.png.</w:t>
       </w:r>
     </w:p>
     <w:p>
@@ -7801,21 +7690,42 @@
             </w:tcBorders>
           </w:tcPr>
           <w:p>
-            <w:r>
-              <w:rPr>
-                <w:rFonts w:ascii="Times New Roman" w:hAnsi="Times New Roman" w:eastAsia="Times New Roman"/>
-                <w:sz w:val="24"/>
-              </w:rPr>
-            </w:r>
-            <w:r>
-              <w:rPr>
-                <w:rFonts w:ascii="Times New Roman" w:hAnsi="Times New Roman" w:eastAsia="Times New Roman"/>
-                <w:b/>
-                <w:i w:val="0"/>
-                <w:color w:val="C00000"/>
-                <w:sz w:val="24"/>
-              </w:rPr>
-              <w:t>[RED — INSERT docs/img/lab.png HERE. Capture: Option 0/A/B/C comparison, recommendation and reserve outcome. Viewport: 1440px. Record case and role in caption. Use a fresh capture; do not substitute historical imagery.]</w:t>
+            <w:pPr>
+              <w:jc val="center"/>
+            </w:pPr>
+            <w:r>
+              <w:drawing>
+                <ns2:inline>
+                  <ns2:extent cx="5577840" cy="4958080"/>
+                  <ns2:docPr id="902" name="lab.png" descr="lab.png"/>
+                  <ns2:cNvGraphicFramePr>
+                    <ns3:graphicFrameLocks noChangeAspect="1"/>
+                  </ns2:cNvGraphicFramePr>
+                  <ns3:graphic>
+                    <ns3:graphicData uri="http://schemas.openxmlformats.org/drawingml/2006/picture">
+                      <ns4:pic>
+                        <ns4:nvPicPr>
+                          <ns4:cNvPr id="902" name="lab.png" descr="lab.png"/>
+                          <ns4:cNvPicPr/>
+                        </ns4:nvPicPr>
+                        <ns4:blipFill>
+                          <ns3:blip ns5:embed="rIdExecutionEvidence2"/>
+                          <ns3:stretch>
+                            <ns3:fillRect/>
+                          </ns3:stretch>
+                        </ns4:blipFill>
+                        <ns4:spPr>
+                          <ns3:xfrm>
+                            <ns3:off x="0" y="0"/>
+                            <ns3:ext cx="5577840" cy="4958080"/>
+                          </ns3:xfrm>
+                          <ns3:prstGeom prst="rect"/>
+                        </ns4:spPr>
+                      </ns4:pic>
+                    </ns3:graphicData>
+                  </ns3:graphic>
+                </ns2:inline>
+              </w:drawing>
             </w:r>
           </w:p>
         </w:tc>
@@ -7835,7 +7745,7 @@
           <w:color w:val="596963"/>
           <w:sz w:val="24"/>
         </w:rPr>
-        <w:t>Fig. 5. Decision Lab evidence placeholder. Replace with a fresh signed-in capture and factual caption.</w:t>
+        <w:t>Fig. 5. Signed-in synthetic-case plan comparison and recommendation. Source: docs/img/lab.png.</w:t>
       </w:r>
     </w:p>
     <w:p>
@@ -7878,21 +7788,42 @@
             </w:tcBorders>
           </w:tcPr>
           <w:p>
-            <w:r>
-              <w:rPr>
-                <w:rFonts w:ascii="Times New Roman" w:hAnsi="Times New Roman" w:eastAsia="Times New Roman"/>
-                <w:sz w:val="24"/>
-              </w:rPr>
-            </w:r>
-            <w:r>
-              <w:rPr>
-                <w:rFonts w:ascii="Times New Roman" w:hAnsi="Times New Roman" w:eastAsia="Times New Roman"/>
-                <w:b/>
-                <w:i w:val="0"/>
-                <w:color w:val="C00000"/>
-                <w:sz w:val="24"/>
-              </w:rPr>
-              <w:t>[RED — INSERT docs/img/financing.png HERE. Capture: Illustrative template, repayment schedule, cost and terms notice. Viewport: 1440px. Record case and role in caption. Use a fresh capture; do not substitute historical imagery.]</w:t>
+            <w:pPr>
+              <w:jc val="center"/>
+            </w:pPr>
+            <w:r>
+              <w:drawing>
+                <ns2:inline>
+                  <ns2:extent cx="5577840" cy="4958080"/>
+                  <ns2:docPr id="903" name="financing.png" descr="financing.png"/>
+                  <ns2:cNvGraphicFramePr>
+                    <ns3:graphicFrameLocks noChangeAspect="1"/>
+                  </ns2:cNvGraphicFramePr>
+                  <ns3:graphic>
+                    <ns3:graphicData uri="http://schemas.openxmlformats.org/drawingml/2006/picture">
+                      <ns4:pic>
+                        <ns4:nvPicPr>
+                          <ns4:cNvPr id="903" name="financing.png" descr="financing.png"/>
+                          <ns4:cNvPicPr/>
+                        </ns4:nvPicPr>
+                        <ns4:blipFill>
+                          <ns3:blip ns5:embed="rIdExecutionEvidence3"/>
+                          <ns3:stretch>
+                            <ns3:fillRect/>
+                          </ns3:stretch>
+                        </ns4:blipFill>
+                        <ns4:spPr>
+                          <ns3:xfrm>
+                            <ns3:off x="0" y="0"/>
+                            <ns3:ext cx="5577840" cy="4958080"/>
+                          </ns3:xfrm>
+                          <ns3:prstGeom prst="rect"/>
+                        </ns4:spPr>
+                      </ns4:pic>
+                    </ns3:graphicData>
+                  </ns3:graphic>
+                </ns2:inline>
+              </w:drawing>
             </w:r>
           </w:p>
         </w:tc>
@@ -7912,7 +7843,7 @@
           <w:color w:val="596963"/>
           <w:sz w:val="24"/>
         </w:rPr>
-        <w:t>Fig. 6. Financing evidence placeholder. Replace with a fresh signed-in capture and factual caption.</w:t>
+        <w:t>Fig. 6. Signed-in illustrative financing view. Source: docs/img/financing.png.</w:t>
       </w:r>
     </w:p>
     <w:p>
@@ -7955,21 +7886,42 @@
             </w:tcBorders>
           </w:tcPr>
           <w:p>
-            <w:r>
-              <w:rPr>
-                <w:rFonts w:ascii="Times New Roman" w:hAnsi="Times New Roman" w:eastAsia="Times New Roman"/>
-                <w:sz w:val="24"/>
-              </w:rPr>
-            </w:r>
-            <w:r>
-              <w:rPr>
-                <w:rFonts w:ascii="Times New Roman" w:hAnsi="Times New Roman" w:eastAsia="Times New Roman"/>
-                <w:b/>
-                <w:i w:val="0"/>
-                <w:color w:val="C00000"/>
-                <w:sz w:val="24"/>
-              </w:rPr>
-              <w:t>[RED — INSERT docs/img/analysis.png HERE. Capture: Business metrics and receivables watchlist for a synthetic case. Viewport: 1440px. Record case and role in caption. Use a fresh capture; do not substitute historical imagery.]</w:t>
+            <w:pPr>
+              <w:jc val="center"/>
+            </w:pPr>
+            <w:r>
+              <w:drawing>
+                <ns2:inline>
+                  <ns2:extent cx="5577840" cy="4958080"/>
+                  <ns2:docPr id="904" name="analysis.png" descr="analysis.png"/>
+                  <ns2:cNvGraphicFramePr>
+                    <ns3:graphicFrameLocks noChangeAspect="1"/>
+                  </ns2:cNvGraphicFramePr>
+                  <ns3:graphic>
+                    <ns3:graphicData uri="http://schemas.openxmlformats.org/drawingml/2006/picture">
+                      <ns4:pic>
+                        <ns4:nvPicPr>
+                          <ns4:cNvPr id="904" name="analysis.png" descr="analysis.png"/>
+                          <ns4:cNvPicPr/>
+                        </ns4:nvPicPr>
+                        <ns4:blipFill>
+                          <ns3:blip ns5:embed="rIdExecutionEvidence4"/>
+                          <ns3:stretch>
+                            <ns3:fillRect/>
+                          </ns3:stretch>
+                        </ns4:blipFill>
+                        <ns4:spPr>
+                          <ns3:xfrm>
+                            <ns3:off x="0" y="0"/>
+                            <ns3:ext cx="5577840" cy="4958080"/>
+                          </ns3:xfrm>
+                          <ns3:prstGeom prst="rect"/>
+                        </ns4:spPr>
+                      </ns4:pic>
+                    </ns3:graphicData>
+                  </ns3:graphic>
+                </ns2:inline>
+              </w:drawing>
             </w:r>
           </w:p>
         </w:tc>
@@ -7989,7 +7941,7 @@
           <w:color w:val="596963"/>
           <w:sz w:val="24"/>
         </w:rPr>
-        <w:t>Fig. 7. Analysis evidence placeholder. Replace with a fresh signed-in capture and factual caption.</w:t>
+        <w:t>Fig. 7. Signed-in synthetic-case analysis and watchlist. Source: docs/img/analysis.png.</w:t>
       </w:r>
     </w:p>
     <w:p>
@@ -8032,21 +7984,42 @@
             </w:tcBorders>
           </w:tcPr>
           <w:p>
-            <w:r>
-              <w:rPr>
-                <w:rFonts w:ascii="Times New Roman" w:hAnsi="Times New Roman" w:eastAsia="Times New Roman"/>
-                <w:sz w:val="24"/>
-              </w:rPr>
-            </w:r>
-            <w:r>
-              <w:rPr>
-                <w:rFonts w:ascii="Times New Roman" w:hAnsi="Times New Roman" w:eastAsia="Times New Roman"/>
-                <w:b/>
-                <w:i w:val="0"/>
-                <w:color w:val="C00000"/>
-                <w:sz w:val="24"/>
-              </w:rPr>
-              <w:t>[RED — INSERT docs/img/copilot.png HERE. Capture: Grounded answer, Evidence used drawer and receipt; note offline/configured mode. Viewport: 1440px. Record case and role in caption. Use a fresh capture; do not substitute historical imagery.]</w:t>
+            <w:pPr>
+              <w:jc val="center"/>
+            </w:pPr>
+            <w:r>
+              <w:drawing>
+                <ns2:inline>
+                  <ns2:extent cx="5577840" cy="4287915"/>
+                  <ns2:docPr id="905" name="copilot.png" descr="copilot.png"/>
+                  <ns2:cNvGraphicFramePr>
+                    <ns3:graphicFrameLocks noChangeAspect="1"/>
+                  </ns2:cNvGraphicFramePr>
+                  <ns3:graphic>
+                    <ns3:graphicData uri="http://schemas.openxmlformats.org/drawingml/2006/picture">
+                      <ns4:pic>
+                        <ns4:nvPicPr>
+                          <ns4:cNvPr id="905" name="copilot.png" descr="copilot.png"/>
+                          <ns4:cNvPicPr/>
+                        </ns4:nvPicPr>
+                        <ns4:blipFill>
+                          <ns3:blip ns5:embed="rIdExecutionEvidence5"/>
+                          <ns3:stretch>
+                            <ns3:fillRect/>
+                          </ns3:stretch>
+                        </ns4:blipFill>
+                        <ns4:spPr>
+                          <ns3:xfrm>
+                            <ns3:off x="0" y="0"/>
+                            <ns3:ext cx="5577840" cy="4287915"/>
+                          </ns3:xfrm>
+                          <ns3:prstGeom prst="rect"/>
+                        </ns4:spPr>
+                      </ns4:pic>
+                    </ns3:graphicData>
+                  </ns3:graphic>
+                </ns2:inline>
+              </w:drawing>
             </w:r>
           </w:p>
         </w:tc>
@@ -8066,7 +8039,7 @@
           <w:color w:val="596963"/>
           <w:sz w:val="24"/>
         </w:rPr>
-        <w:t>Fig. 8. Copilot evidence placeholder. Replace with a fresh signed-in capture and factual caption.</w:t>
+        <w:t>Fig. 8. Signed-in Copilot response and evidence area. Source: docs/img/copilot.png.</w:t>
       </w:r>
     </w:p>
     <w:p>
@@ -8109,21 +8082,42 @@
             </w:tcBorders>
           </w:tcPr>
           <w:p>
-            <w:r>
-              <w:rPr>
-                <w:rFonts w:ascii="Times New Roman" w:hAnsi="Times New Roman" w:eastAsia="Times New Roman"/>
-                <w:sz w:val="24"/>
-              </w:rPr>
-            </w:r>
-            <w:r>
-              <w:rPr>
-                <w:rFonts w:ascii="Times New Roman" w:hAnsi="Times New Roman" w:eastAsia="Times New Roman"/>
-                <w:b/>
-                <w:i w:val="0"/>
-                <w:color w:val="C00000"/>
-                <w:sz w:val="24"/>
-              </w:rPr>
-              <w:t>[RED — INSERT docs/img/approvals.png HERE. Capture: Draft submission, owner review controls and timeline; no real message sent. Viewport: 1440px. Record case and role in caption. Use a fresh capture; do not substitute historical imagery.]</w:t>
+            <w:pPr>
+              <w:jc val="center"/>
+            </w:pPr>
+            <w:r>
+              <w:drawing>
+                <ns2:inline>
+                  <ns2:extent cx="5577840" cy="6430010"/>
+                  <ns2:docPr id="906" name="approvals-workflow.png" descr="approvals-workflow.png"/>
+                  <ns2:cNvGraphicFramePr>
+                    <ns3:graphicFrameLocks noChangeAspect="1"/>
+                  </ns2:cNvGraphicFramePr>
+                  <ns3:graphic>
+                    <ns3:graphicData uri="http://schemas.openxmlformats.org/drawingml/2006/picture">
+                      <ns4:pic>
+                        <ns4:nvPicPr>
+                          <ns4:cNvPr id="906" name="approvals-workflow.png" descr="approvals-workflow.png"/>
+                          <ns4:cNvPicPr/>
+                        </ns4:nvPicPr>
+                        <ns4:blipFill>
+                          <ns3:blip ns5:embed="rIdExecutionEvidence6"/>
+                          <ns3:stretch>
+                            <ns3:fillRect/>
+                          </ns3:stretch>
+                        </ns4:blipFill>
+                        <ns4:spPr>
+                          <ns3:xfrm>
+                            <ns3:off x="0" y="0"/>
+                            <ns3:ext cx="5577840" cy="6430010"/>
+                          </ns3:xfrm>
+                          <ns3:prstGeom prst="rect"/>
+                        </ns4:spPr>
+                      </ns4:pic>
+                    </ns3:graphicData>
+                  </ns3:graphic>
+                </ns2:inline>
+              </w:drawing>
             </w:r>
           </w:p>
         </w:tc>
@@ -8143,7 +8137,7 @@
           <w:color w:val="596963"/>
           <w:sz w:val="24"/>
         </w:rPr>
-        <w:t>Fig. 9. Approvals evidence placeholder. Replace with a fresh signed-in capture and factual caption.</w:t>
+        <w:t>Fig. 9. Synthetic draft approval workflow; UI states alone do not prove recorded execution. Source: docs/img/approvals-workflow.png.</w:t>
       </w:r>
     </w:p>
     <w:p>
@@ -8186,21 +8180,42 @@
             </w:tcBorders>
           </w:tcPr>
           <w:p>
-            <w:r>
-              <w:rPr>
-                <w:rFonts w:ascii="Times New Roman" w:hAnsi="Times New Roman" w:eastAsia="Times New Roman"/>
-                <w:sz w:val="24"/>
-              </w:rPr>
-            </w:r>
-            <w:r>
-              <w:rPr>
-                <w:rFonts w:ascii="Times New Roman" w:hAnsi="Times New Roman" w:eastAsia="Times New Roman"/>
-                <w:b/>
-                <w:i w:val="0"/>
-                <w:color w:val="C00000"/>
-                <w:sz w:val="24"/>
-              </w:rPr>
-              <w:t>[RED — INSERT docs/img/upload.png HERE. Capture: Validation results including formula-like cell neutralization and row-level report. Viewport: 1440px. Record case and role in caption. Use a fresh capture; do not substitute historical imagery.]</w:t>
+            <w:pPr>
+              <w:jc val="center"/>
+            </w:pPr>
+            <w:r>
+              <w:drawing>
+                <ns2:inline>
+                  <ns2:extent cx="5577840" cy="4958080"/>
+                  <ns2:docPr id="907" name="upload.png" descr="upload.png"/>
+                  <ns2:cNvGraphicFramePr>
+                    <ns3:graphicFrameLocks noChangeAspect="1"/>
+                  </ns2:cNvGraphicFramePr>
+                  <ns3:graphic>
+                    <ns3:graphicData uri="http://schemas.openxmlformats.org/drawingml/2006/picture">
+                      <ns4:pic>
+                        <ns4:nvPicPr>
+                          <ns4:cNvPr id="907" name="upload.png" descr="upload.png"/>
+                          <ns4:cNvPicPr/>
+                        </ns4:nvPicPr>
+                        <ns4:blipFill>
+                          <ns3:blip ns5:embed="rIdExecutionEvidence7"/>
+                          <ns3:stretch>
+                            <ns3:fillRect/>
+                          </ns3:stretch>
+                        </ns4:blipFill>
+                        <ns4:spPr>
+                          <ns3:xfrm>
+                            <ns3:off x="0" y="0"/>
+                            <ns3:ext cx="5577840" cy="4958080"/>
+                          </ns3:xfrm>
+                          <ns3:prstGeom prst="rect"/>
+                        </ns4:spPr>
+                      </ns4:pic>
+                    </ns3:graphicData>
+                  </ns3:graphic>
+                </ns2:inline>
+              </w:drawing>
             </w:r>
           </w:p>
         </w:tc>
@@ -8220,7 +8235,7 @@
           <w:color w:val="596963"/>
           <w:sz w:val="24"/>
         </w:rPr>
-        <w:t>Fig. 10. Upload evidence placeholder. Replace with a fresh signed-in capture and factual caption.</w:t>
+        <w:t>Fig. 10. Signed-in upload validation view. Source: docs/img/upload.png.</w:t>
       </w:r>
     </w:p>
     <w:p>
@@ -8263,21 +8278,42 @@
             </w:tcBorders>
           </w:tcPr>
           <w:p>
-            <w:r>
-              <w:rPr>
-                <w:rFonts w:ascii="Times New Roman" w:hAnsi="Times New Roman" w:eastAsia="Times New Roman"/>
-                <w:sz w:val="24"/>
-              </w:rPr>
-            </w:r>
-            <w:r>
-              <w:rPr>
-                <w:rFonts w:ascii="Times New Roman" w:hAnsi="Times New Roman" w:eastAsia="Times New Roman"/>
-                <w:b/>
-                <w:i w:val="0"/>
-                <w:color w:val="C00000"/>
-                <w:sz w:val="24"/>
-              </w:rPr>
-              <w:t>[RED — INSERT docs/img/security.png HERE. Capture: Role/action matrix and security status with role context. Viewport: 1440px. Record case and role in caption. Use a fresh capture; do not substitute historical imagery.]</w:t>
+            <w:pPr>
+              <w:jc val="center"/>
+            </w:pPr>
+            <w:r>
+              <w:drawing>
+                <ns2:inline>
+                  <ns2:extent cx="5577840" cy="4958080"/>
+                  <ns2:docPr id="908" name="security.png" descr="security.png"/>
+                  <ns2:cNvGraphicFramePr>
+                    <ns3:graphicFrameLocks noChangeAspect="1"/>
+                  </ns2:cNvGraphicFramePr>
+                  <ns3:graphic>
+                    <ns3:graphicData uri="http://schemas.openxmlformats.org/drawingml/2006/picture">
+                      <ns4:pic>
+                        <ns4:nvPicPr>
+                          <ns4:cNvPr id="908" name="security.png" descr="security.png"/>
+                          <ns4:cNvPicPr/>
+                        </ns4:nvPicPr>
+                        <ns4:blipFill>
+                          <ns3:blip ns5:embed="rIdExecutionEvidence8"/>
+                          <ns3:stretch>
+                            <ns3:fillRect/>
+                          </ns3:stretch>
+                        </ns4:blipFill>
+                        <ns4:spPr>
+                          <ns3:xfrm>
+                            <ns3:off x="0" y="0"/>
+                            <ns3:ext cx="5577840" cy="4958080"/>
+                          </ns3:xfrm>
+                          <ns3:prstGeom prst="rect"/>
+                        </ns4:spPr>
+                      </ns4:pic>
+                    </ns3:graphicData>
+                  </ns3:graphic>
+                </ns2:inline>
+              </w:drawing>
             </w:r>
           </w:p>
         </w:tc>
@@ -8297,7 +8333,7 @@
           <w:color w:val="596963"/>
           <w:sz w:val="24"/>
         </w:rPr>
-        <w:t>Fig. 11. Security evidence placeholder. Replace with a fresh signed-in capture and factual caption.</w:t>
+        <w:t>Fig. 11. Signed-in security role/action view. Source: docs/img/security.png.</w:t>
       </w:r>
     </w:p>
     <w:tbl>
@@ -8522,7 +8558,7 @@
                 <w:color w:val="183A35"/>
                 <w:sz w:val="24"/>
               </w:rPr>
-              <w:t>Absent</w:t>
+              <w:t>Present; embedded in report</w:t>
             </w:r>
           </w:p>
         </w:tc>
@@ -8632,7 +8668,7 @@
                 <w:color w:val="183A35"/>
                 <w:sz w:val="24"/>
               </w:rPr>
-              <w:t>Absent</w:t>
+              <w:t>Present; embedded in report</w:t>
             </w:r>
           </w:p>
         </w:tc>
@@ -8742,7 +8778,7 @@
                 <w:color w:val="183A35"/>
                 <w:sz w:val="24"/>
               </w:rPr>
-              <w:t>Absent</w:t>
+              <w:t>Present; embedded in report</w:t>
             </w:r>
           </w:p>
         </w:tc>
@@ -8852,7 +8888,7 @@
                 <w:color w:val="183A35"/>
                 <w:sz w:val="24"/>
               </w:rPr>
-              <w:t>Absent</w:t>
+              <w:t>Present; embedded in report</w:t>
             </w:r>
           </w:p>
         </w:tc>
@@ -8962,7 +8998,7 @@
                 <w:color w:val="183A35"/>
                 <w:sz w:val="24"/>
               </w:rPr>
-              <w:t>Absent</w:t>
+              <w:t>Present; embedded in report</w:t>
             </w:r>
           </w:p>
         </w:tc>
@@ -9072,7 +9108,7 @@
                 <w:color w:val="183A35"/>
                 <w:sz w:val="24"/>
               </w:rPr>
-              <w:t>Absent</w:t>
+              <w:t>Present; embedded in report</w:t>
             </w:r>
           </w:p>
         </w:tc>
@@ -9182,7 +9218,7 @@
                 <w:color w:val="183A35"/>
                 <w:sz w:val="24"/>
               </w:rPr>
-              <w:t>Absent</w:t>
+              <w:t>Present; embedded in report</w:t>
             </w:r>
           </w:p>
         </w:tc>
@@ -9292,7 +9328,7 @@
                 <w:color w:val="183A35"/>
                 <w:sz w:val="24"/>
               </w:rPr>
-              <w:t>Absent</w:t>
+              <w:t>Present; embedded in report</w:t>
             </w:r>
           </w:p>
         </w:tc>
@@ -9332,7 +9368,7 @@
           <w:color w:val="166B52"/>
           <w:sz w:val="24"/>
         </w:rPr>
-        <w:t>6. Reproduction and evidence capture protocol</w:t>
+        <w:t>6. Sandbox log and demo video status</w:t>
       </w:r>
     </w:p>
     <w:p>
@@ -9346,7 +9382,7 @@
           <w:i w:val="0"/>
           <w:sz w:val="24"/>
         </w:rPr>
-        <w:t>Use a clean local checkout and retain the complete output of each run. Preserve the existing dated transcript; create a new timestamped artifact for new execution results.</w:t>
+        <w:t>Use a clean local checkout and retain the complete output of each run. Preserve the existing dated transcript; create a new timestamped artifact for new execution results. Topic E is non-on-chain, so transaction hashes are not applicable.</w:t>
       </w:r>
     </w:p>
     <w:tbl>
@@ -10159,7 +10195,7 @@
           <w:i w:val="0"/>
           <w:sz w:val="24"/>
         </w:rPr>
-        <w:t>For screenshots, remove browser chrome without cropping away application context. Do not expose credentials, API keys, real personal data or unsanitized local paths. The runtime simulated-action log at evidence/sandbox_log.jsonl is a default destination only; it is absent from the reviewed tree and must not be represented as an existing execution artifact [E7].</w:t>
+        <w:t>The action-simulation service is designed to append local JSONL evidence at evidence/sandbox_log.jsonl with network_sent=false; that runtime file is absent from the reviewed tree. The repository has a demo script at docs/DEMO_SCRIPT.md, but no recorded demo video. No live sandbox execution or video is claimed by this report.</w:t>
       </w:r>
     </w:p>
     <w:p>
@@ -11128,7 +11164,7 @@
                 <w:color w:val="183A35"/>
                 <w:sz w:val="24"/>
               </w:rPr>
-              <w:t>docs/img/overview.png; evidence/t02-overview-review.png</w:t>
+              <w:t>docs/img/*.png; evidence/t02-overview-review.png</w:t>
             </w:r>
           </w:p>
         </w:tc>
@@ -11164,7 +11200,7 @@
                 <w:color w:val="183A35"/>
                 <w:sz w:val="24"/>
               </w:rPr>
-              <w:t>Current public and historical UI captures</w:t>
+              <w:t>Public and signed-in synthetic UI captures present; historical view kept separate</w:t>
             </w:r>
           </w:p>
         </w:tc>
@@ -11200,7 +11236,7 @@
                 <w:color w:val="183A35"/>
                 <w:sz w:val="24"/>
               </w:rPr>
-              <w:t>Both present; historical clearly labeled</w:t>
+              <w:t>Present; 8 core views embedded in report</w:t>
             </w:r>
           </w:p>
         </w:tc>
@@ -11310,7 +11346,7 @@
                 <w:color w:val="183A35"/>
                 <w:sz w:val="24"/>
               </w:rPr>
-              <w:t>Evidence index, screenshot requests and absent runtime log note</w:t>
+              <w:t>Current evidence index, including log/video status</w:t>
             </w:r>
           </w:p>
         </w:tc>
@@ -11687,7 +11723,7 @@
                 <w:color w:val="183A35"/>
                 <w:sz w:val="24"/>
               </w:rPr>
-              <w:t>The archived test artifact proves 205 tests passed; that count appears only in a later progress summary here.</w:t>
+              <w:t>No other full-suite result is included in the reviewed artifacts.</w:t>
             </w:r>
           </w:p>
         </w:tc>
@@ -11947,7 +11983,7 @@
                 <w:color w:val="183A35"/>
                 <w:sz w:val="24"/>
               </w:rPr>
-              <w:t>A public Overview screenshot exists; eight signed-in captures remain.</w:t>
+              <w:t>Public Overview and selected signed-in synthetic-workflow screenshots are present.</w:t>
             </w:r>
           </w:p>
         </w:tc>
@@ -11983,7 +12019,7 @@
                 <w:color w:val="183A35"/>
                 <w:sz w:val="24"/>
               </w:rPr>
-              <w:t>All pages were visually verified or the historical image shows the current design.</w:t>
+              <w:t>Every page was live-verified or a demo video is included.</w:t>
             </w:r>
           </w:p>
         </w:tc>
@@ -12021,7 +12057,7 @@
                 <w:color w:val="183A35"/>
                 <w:sz w:val="24"/>
               </w:rPr>
-              <w:t>The described action simulation is local-only; its runtime log is absent from the reviewed tree.</w:t>
+              <w:t>The app describes a local-only simulation; scripted workflow evidence and UI captures are checked in.</w:t>
             </w:r>
           </w:p>
         </w:tc>
@@ -12057,7 +12093,7 @@
                 <w:color w:val="183A35"/>
                 <w:sz w:val="24"/>
               </w:rPr>
-              <w:t>A runtime action log exists or any real payment/action was executed.</w:t>
+              <w:t>A runtime sandbox log or recorded demo video exists in this checkout.</w:t>
             </w:r>
           </w:p>
         </w:tc>
@@ -12095,7 +12131,7 @@
           <w:i w:val="0"/>
           <w:sz w:val="24"/>
         </w:rPr>
-        <w:t>All conclusions are limited to a synthetic-data prototype and the recorded runs. Forecast calibration, external review, production identity, monitoring, provider privacy controls and complete signed-in visual evidence are outside these results. For security caveats see [E8]; for algorithms and state transitions see docs/TECHNICAL_DOC.md and the Technical Documentation report.</w:t>
+        <w:t>All conclusions are limited to a synthetic-data prototype and the artifacts reviewed. UI captures provide visual evidence of selected synthetic workflows. The reviewed package does not include a runtime sandbox JSONL log or demo video; no on-chain transaction hashes apply to this non-on-chain topic. Production identity, monitoring, provider privacy controls and external review remain outside these results. For security caveats see [E8]; for algorithms and state transitions see docs/TECHNICAL_DOC.md and docs/Technical_Documentation_StratifyAI.docx.</w:t>
       </w:r>
     </w:p>
     <w:p>
@@ -12237,12 +12273,12 @@
           <w:i w:val="0"/>
           <w:sz w:val="24"/>
         </w:rPr>
-        <w:t>Context: README.md, docs/TECHNICAL_DOC.md and docs/PROGRESS.md; reviewed 2026-10-20.</w:t>
+        <w:t>Context: README.md, docs/TECHNICAL_DOC.md and docs/EXECUTION_EVIDENCE.md; reviewed 2026-10-20.</w:t>
       </w:r>
     </w:p>
     <w:sectPr>
-      <w:headerReference w:type="default" r:id="rId9"/>
-      <w:footerReference w:type="default" r:id="rId10"/>
+      <w:headerReference w:type="default" ns5:id="rId9"/>
+      <w:footerReference w:type="default" ns5:id="rId10"/>
       <w:pgSz w:w="12240" w:h="15840"/>
       <w:pgMar w:top="979" w:right="1037" w:bottom="979" w:left="1037" w:header="720" w:footer="720" w:gutter="0"/>
       <w:cols w:space="720"/>

</xml_diff>

<commit_message>
fix: rebuild Word-compatible execution report
</commit_message>
<xml_diff>
--- a/docs/Execution_Evidence_Report.docx
+++ b/docs/Execution_Evidence_Report.docx
@@ -1,6 +1,6 @@
 
 <file path=word/document.xml><?xml version="1.0" encoding="utf-8"?>
-<w:document xmlns:ns1="http://schemas.openxmlformats.org/markup-compatibility/2006" xmlns:ns2="http://schemas.openxmlformats.org/drawingml/2006/wordprocessingDrawing" xmlns:ns3="http://schemas.openxmlformats.org/drawingml/2006/main" xmlns:ns4="http://schemas.openxmlformats.org/drawingml/2006/picture" xmlns:ns5="http://schemas.openxmlformats.org/officeDocument/2006/relationships" xmlns:w="http://schemas.openxmlformats.org/wordprocessingml/2006/main" xmlns:w14="http://schemas.microsoft.com/office/word/2010/wordml" xmlns:wp14="http://schemas.microsoft.com/office/word/2010/wordprocessingDrawing" ns1:Ignorable="w14 wp14">
+<w:document xmlns:wpc="http://schemas.microsoft.com/office/word/2010/wordprocessingCanvas" xmlns:mo="http://schemas.microsoft.com/office/mac/office/2008/main" xmlns:mc="http://schemas.openxmlformats.org/markup-compatibility/2006" xmlns:mv="urn:schemas-microsoft-com:mac:vml" xmlns:o="urn:schemas-microsoft-com:office:office" xmlns:r="http://schemas.openxmlformats.org/officeDocument/2006/relationships" xmlns:m="http://schemas.openxmlformats.org/officeDocument/2006/math" xmlns:v="urn:schemas-microsoft-com:vml" xmlns:wp14="http://schemas.microsoft.com/office/word/2010/wordprocessingDrawing" xmlns:wp="http://schemas.openxmlformats.org/drawingml/2006/wordprocessingDrawing" xmlns:w10="urn:schemas-microsoft-com:office:word" xmlns:w="http://schemas.openxmlformats.org/wordprocessingml/2006/main" xmlns:w14="http://schemas.microsoft.com/office/word/2010/wordml" xmlns:wpg="http://schemas.microsoft.com/office/word/2010/wordprocessingGroup" xmlns:wpi="http://schemas.microsoft.com/office/word/2010/wordprocessingInk" xmlns:wne="http://schemas.microsoft.com/office/word/2006/wordml" xmlns:wps="http://schemas.microsoft.com/office/word/2010/wordprocessingShape" mc:Ignorable="w14 wp14">
   <w:body>
     <w:p>
       <w:pPr>
@@ -1324,6 +1324,7 @@
                 <w:rFonts w:ascii="Times New Roman" w:hAnsi="Times New Roman" w:eastAsia="Times New Roman"/>
                 <w:sz w:val="24"/>
               </w:rPr>
+              <w:t>Signed-in screenshots present; sandbox log/video absent</w:t>
             </w:r>
             <w:r>
               <w:rPr>
@@ -1333,7 +1334,6 @@
                 <w:color w:val="183A35"/>
                 <w:sz w:val="24"/>
               </w:rPr>
-              <w:t>Signed-in screenshots present; sandbox log/video absent</w:t>
             </w:r>
           </w:p>
         </w:tc>
@@ -1360,6 +1360,7 @@
                 <w:rFonts w:ascii="Times New Roman" w:hAnsi="Times New Roman" w:eastAsia="Times New Roman"/>
                 <w:sz w:val="24"/>
               </w:rPr>
+              <w:t>Selected synthetic UI states are visible</w:t>
             </w:r>
             <w:r>
               <w:rPr>
@@ -1369,7 +1370,6 @@
                 <w:color w:val="183A35"/>
                 <w:sz w:val="24"/>
               </w:rPr>
-              <w:t>Selected synthetic UI states are visible</w:t>
             </w:r>
           </w:p>
         </w:tc>
@@ -1396,6 +1396,7 @@
                 <w:rFonts w:ascii="Times New Roman" w:hAnsi="Times New Roman" w:eastAsia="Times New Roman"/>
                 <w:sz w:val="24"/>
               </w:rPr>
+              <w:t>Live sandbox execution, full video walkthrough or production validation</w:t>
             </w:r>
             <w:r>
               <w:rPr>
@@ -1405,7 +1406,6 @@
                 <w:color w:val="183A35"/>
                 <w:sz w:val="24"/>
               </w:rPr>
-              <w:t>Live sandbox execution, full video walkthrough or production validation</w:t>
             </w:r>
           </w:p>
         </w:tc>
@@ -1459,7 +1459,7 @@
           <w:i w:val="0"/>
           <w:sz w:val="24"/>
         </w:rPr>
-        <w:t>Evidence identifiers [E1]?[E8] refer to repository artifacts in Section 7. Results are transcribed from checked-in records; this document does not rerun tests or create runtime evidence. A recorded PASS means only that the listed assertion or workflow passed in its stated run.</w:t>
+        <w:t>Evidence identifiers [E1]-[E8] refer to repository artifacts in Section 7. Results are transcribed from checked-in records; this document does not rerun tests or create runtime evidence. A recorded PASS means only that the listed assertion or workflow passed in its stated run.</w:t>
       </w:r>
     </w:p>
     <w:p>
@@ -7398,36 +7398,36 @@
           <w:sz w:val="24"/>
         </w:rPr>
         <w:drawing>
-          <ns2:inline>
-            <ns2:extent cx="5669280" cy="4330700"/>
-            <ns2:docPr id="1" name="Picture 1"/>
-            <ns2:cNvGraphicFramePr>
-              <ns3:graphicFrameLocks noChangeAspect="1"/>
-            </ns2:cNvGraphicFramePr>
-            <ns3:graphic>
-              <ns3:graphicData uri="http://schemas.openxmlformats.org/drawingml/2006/picture">
-                <ns4:pic>
-                  <ns4:nvPicPr>
-                    <ns4:cNvPr id="0" name="overview.png"/>
-                    <ns4:cNvPicPr/>
-                  </ns4:nvPicPr>
-                  <ns4:blipFill>
-                    <ns3:blip ns5:embed="rId11"/>
-                    <ns3:stretch>
-                      <ns3:fillRect/>
-                    </ns3:stretch>
-                  </ns4:blipFill>
-                  <ns4:spPr>
-                    <ns3:xfrm>
-                      <ns3:off x="0" y="0"/>
-                      <ns3:ext cx="5669280" cy="4330700"/>
-                    </ns3:xfrm>
-                    <ns3:prstGeom prst="rect"/>
-                  </ns4:spPr>
-                </ns4:pic>
-              </ns3:graphicData>
-            </ns3:graphic>
-          </ns2:inline>
+          <wp:inline xmlns:a="http://schemas.openxmlformats.org/drawingml/2006/main" xmlns:pic="http://schemas.openxmlformats.org/drawingml/2006/picture">
+            <wp:extent cx="5669280" cy="4330700"/>
+            <wp:docPr id="1" name="Picture 1"/>
+            <wp:cNvGraphicFramePr>
+              <a:graphicFrameLocks noChangeAspect="1"/>
+            </wp:cNvGraphicFramePr>
+            <a:graphic>
+              <a:graphicData uri="http://schemas.openxmlformats.org/drawingml/2006/picture">
+                <pic:pic>
+                  <pic:nvPicPr>
+                    <pic:cNvPr id="0" name="overview.png"/>
+                    <pic:cNvPicPr/>
+                  </pic:nvPicPr>
+                  <pic:blipFill>
+                    <a:blip r:embed="rId11"/>
+                    <a:stretch>
+                      <a:fillRect/>
+                    </a:stretch>
+                  </pic:blipFill>
+                  <pic:spPr>
+                    <a:xfrm>
+                      <a:off x="0" y="0"/>
+                      <a:ext cx="5669280" cy="4330700"/>
+                    </a:xfrm>
+                    <a:prstGeom prst="rect"/>
+                  </pic:spPr>
+                </pic:pic>
+              </a:graphicData>
+            </a:graphic>
+          </wp:inline>
         </w:drawing>
       </w:r>
     </w:p>
@@ -7473,36 +7473,36 @@
           <w:sz w:val="24"/>
         </w:rPr>
         <w:drawing>
-          <ns2:inline>
-            <ns2:extent cx="5303520" cy="3776976"/>
-            <ns2:docPr id="2" name="Picture 2"/>
-            <ns2:cNvGraphicFramePr>
-              <ns3:graphicFrameLocks noChangeAspect="1"/>
-            </ns2:cNvGraphicFramePr>
-            <ns3:graphic>
-              <ns3:graphicData uri="http://schemas.openxmlformats.org/drawingml/2006/picture">
-                <ns4:pic>
-                  <ns4:nvPicPr>
-                    <ns4:cNvPr id="0" name="t02-overview-review.png"/>
-                    <ns4:cNvPicPr/>
-                  </ns4:nvPicPr>
-                  <ns4:blipFill>
-                    <ns3:blip ns5:embed="rId12"/>
-                    <ns3:stretch>
-                      <ns3:fillRect/>
-                    </ns3:stretch>
-                  </ns4:blipFill>
-                  <ns4:spPr>
-                    <ns3:xfrm>
-                      <ns3:off x="0" y="0"/>
-                      <ns3:ext cx="5303520" cy="3776976"/>
-                    </ns3:xfrm>
-                    <ns3:prstGeom prst="rect"/>
-                  </ns4:spPr>
-                </ns4:pic>
-              </ns3:graphicData>
-            </ns3:graphic>
-          </ns2:inline>
+          <wp:inline xmlns:a="http://schemas.openxmlformats.org/drawingml/2006/main" xmlns:pic="http://schemas.openxmlformats.org/drawingml/2006/picture">
+            <wp:extent cx="5303520" cy="3776976"/>
+            <wp:docPr id="2" name="Picture 2"/>
+            <wp:cNvGraphicFramePr>
+              <a:graphicFrameLocks noChangeAspect="1"/>
+            </wp:cNvGraphicFramePr>
+            <a:graphic>
+              <a:graphicData uri="http://schemas.openxmlformats.org/drawingml/2006/picture">
+                <pic:pic>
+                  <pic:nvPicPr>
+                    <pic:cNvPr id="0" name="t02-overview-review.png"/>
+                    <pic:cNvPicPr/>
+                  </pic:nvPicPr>
+                  <pic:blipFill>
+                    <a:blip r:embed="rId12"/>
+                    <a:stretch>
+                      <a:fillRect/>
+                    </a:stretch>
+                  </pic:blipFill>
+                  <pic:spPr>
+                    <a:xfrm>
+                      <a:off x="0" y="0"/>
+                      <a:ext cx="5303520" cy="3776976"/>
+                    </a:xfrm>
+                    <a:prstGeom prst="rect"/>
+                  </pic:spPr>
+                </pic:pic>
+              </a:graphicData>
+            </a:graphic>
+          </wp:inline>
         </w:drawing>
       </w:r>
     </w:p>
@@ -7593,40 +7593,40 @@
           </w:tcPr>
           <w:p>
             <w:pPr>
-              <w:jc val="center"/>
+              <w:jc w:val="center"/>
             </w:pPr>
             <w:r>
               <w:drawing>
-                <ns2:inline>
-                  <ns2:extent cx="5577840" cy="4958080"/>
-                  <ns2:docPr id="901" name="cashflow.png" descr="cashflow.png"/>
-                  <ns2:cNvGraphicFramePr>
-                    <ns3:graphicFrameLocks noChangeAspect="1"/>
-                  </ns2:cNvGraphicFramePr>
-                  <ns3:graphic>
-                    <ns3:graphicData uri="http://schemas.openxmlformats.org/drawingml/2006/picture">
-                      <ns4:pic>
-                        <ns4:nvPicPr>
-                          <ns4:cNvPr id="901" name="cashflow.png" descr="cashflow.png"/>
-                          <ns4:cNvPicPr/>
-                        </ns4:nvPicPr>
-                        <ns4:blipFill>
-                          <ns3:blip ns5:embed="rIdExecutionEvidence1"/>
-                          <ns3:stretch>
-                            <ns3:fillRect/>
-                          </ns3:stretch>
-                        </ns4:blipFill>
-                        <ns4:spPr>
-                          <ns3:xfrm>
-                            <ns3:off x="0" y="0"/>
-                            <ns3:ext cx="5577840" cy="4958080"/>
-                          </ns3:xfrm>
-                          <ns3:prstGeom prst="rect"/>
-                        </ns4:spPr>
-                      </ns4:pic>
-                    </ns3:graphicData>
-                  </ns3:graphic>
-                </ns2:inline>
+                <wp:inline xmlns:a="http://schemas.openxmlformats.org/drawingml/2006/main" xmlns:pic="http://schemas.openxmlformats.org/drawingml/2006/picture">
+                  <wp:extent cx="5486400" cy="4876800"/>
+                  <wp:docPr id="3" name="Picture 3"/>
+                  <wp:cNvGraphicFramePr>
+                    <a:graphicFrameLocks noChangeAspect="1"/>
+                  </wp:cNvGraphicFramePr>
+                  <a:graphic>
+                    <a:graphicData uri="http://schemas.openxmlformats.org/drawingml/2006/picture">
+                      <pic:pic>
+                        <pic:nvPicPr>
+                          <pic:cNvPr id="0" name="cashflow.png"/>
+                          <pic:cNvPicPr/>
+                        </pic:nvPicPr>
+                        <pic:blipFill>
+                          <a:blip r:embed="rId13"/>
+                          <a:stretch>
+                            <a:fillRect/>
+                          </a:stretch>
+                        </pic:blipFill>
+                        <pic:spPr>
+                          <a:xfrm>
+                            <a:off x="0" y="0"/>
+                            <a:ext cx="5486400" cy="4876800"/>
+                          </a:xfrm>
+                          <a:prstGeom prst="rect"/>
+                        </pic:spPr>
+                      </pic:pic>
+                    </a:graphicData>
+                  </a:graphic>
+                </wp:inline>
               </w:drawing>
             </w:r>
           </w:p>
@@ -7691,40 +7691,40 @@
           </w:tcPr>
           <w:p>
             <w:pPr>
-              <w:jc val="center"/>
+              <w:jc w:val="center"/>
             </w:pPr>
             <w:r>
               <w:drawing>
-                <ns2:inline>
-                  <ns2:extent cx="5577840" cy="4958080"/>
-                  <ns2:docPr id="902" name="lab.png" descr="lab.png"/>
-                  <ns2:cNvGraphicFramePr>
-                    <ns3:graphicFrameLocks noChangeAspect="1"/>
-                  </ns2:cNvGraphicFramePr>
-                  <ns3:graphic>
-                    <ns3:graphicData uri="http://schemas.openxmlformats.org/drawingml/2006/picture">
-                      <ns4:pic>
-                        <ns4:nvPicPr>
-                          <ns4:cNvPr id="902" name="lab.png" descr="lab.png"/>
-                          <ns4:cNvPicPr/>
-                        </ns4:nvPicPr>
-                        <ns4:blipFill>
-                          <ns3:blip ns5:embed="rIdExecutionEvidence2"/>
-                          <ns3:stretch>
-                            <ns3:fillRect/>
-                          </ns3:stretch>
-                        </ns4:blipFill>
-                        <ns4:spPr>
-                          <ns3:xfrm>
-                            <ns3:off x="0" y="0"/>
-                            <ns3:ext cx="5577840" cy="4958080"/>
-                          </ns3:xfrm>
-                          <ns3:prstGeom prst="rect"/>
-                        </ns4:spPr>
-                      </ns4:pic>
-                    </ns3:graphicData>
-                  </ns3:graphic>
-                </ns2:inline>
+                <wp:inline xmlns:a="http://schemas.openxmlformats.org/drawingml/2006/main" xmlns:pic="http://schemas.openxmlformats.org/drawingml/2006/picture">
+                  <wp:extent cx="5486400" cy="4876800"/>
+                  <wp:docPr id="4" name="Picture 4"/>
+                  <wp:cNvGraphicFramePr>
+                    <a:graphicFrameLocks noChangeAspect="1"/>
+                  </wp:cNvGraphicFramePr>
+                  <a:graphic>
+                    <a:graphicData uri="http://schemas.openxmlformats.org/drawingml/2006/picture">
+                      <pic:pic>
+                        <pic:nvPicPr>
+                          <pic:cNvPr id="0" name="lab.png"/>
+                          <pic:cNvPicPr/>
+                        </pic:nvPicPr>
+                        <pic:blipFill>
+                          <a:blip r:embed="rId14"/>
+                          <a:stretch>
+                            <a:fillRect/>
+                          </a:stretch>
+                        </pic:blipFill>
+                        <pic:spPr>
+                          <a:xfrm>
+                            <a:off x="0" y="0"/>
+                            <a:ext cx="5486400" cy="4876800"/>
+                          </a:xfrm>
+                          <a:prstGeom prst="rect"/>
+                        </pic:spPr>
+                      </pic:pic>
+                    </a:graphicData>
+                  </a:graphic>
+                </wp:inline>
               </w:drawing>
             </w:r>
           </w:p>
@@ -7789,40 +7789,40 @@
           </w:tcPr>
           <w:p>
             <w:pPr>
-              <w:jc val="center"/>
+              <w:jc w:val="center"/>
             </w:pPr>
             <w:r>
               <w:drawing>
-                <ns2:inline>
-                  <ns2:extent cx="5577840" cy="4958080"/>
-                  <ns2:docPr id="903" name="financing.png" descr="financing.png"/>
-                  <ns2:cNvGraphicFramePr>
-                    <ns3:graphicFrameLocks noChangeAspect="1"/>
-                  </ns2:cNvGraphicFramePr>
-                  <ns3:graphic>
-                    <ns3:graphicData uri="http://schemas.openxmlformats.org/drawingml/2006/picture">
-                      <ns4:pic>
-                        <ns4:nvPicPr>
-                          <ns4:cNvPr id="903" name="financing.png" descr="financing.png"/>
-                          <ns4:cNvPicPr/>
-                        </ns4:nvPicPr>
-                        <ns4:blipFill>
-                          <ns3:blip ns5:embed="rIdExecutionEvidence3"/>
-                          <ns3:stretch>
-                            <ns3:fillRect/>
-                          </ns3:stretch>
-                        </ns4:blipFill>
-                        <ns4:spPr>
-                          <ns3:xfrm>
-                            <ns3:off x="0" y="0"/>
-                            <ns3:ext cx="5577840" cy="4958080"/>
-                          </ns3:xfrm>
-                          <ns3:prstGeom prst="rect"/>
-                        </ns4:spPr>
-                      </ns4:pic>
-                    </ns3:graphicData>
-                  </ns3:graphic>
-                </ns2:inline>
+                <wp:inline xmlns:a="http://schemas.openxmlformats.org/drawingml/2006/main" xmlns:pic="http://schemas.openxmlformats.org/drawingml/2006/picture">
+                  <wp:extent cx="5486400" cy="4876800"/>
+                  <wp:docPr id="5" name="Picture 5"/>
+                  <wp:cNvGraphicFramePr>
+                    <a:graphicFrameLocks noChangeAspect="1"/>
+                  </wp:cNvGraphicFramePr>
+                  <a:graphic>
+                    <a:graphicData uri="http://schemas.openxmlformats.org/drawingml/2006/picture">
+                      <pic:pic>
+                        <pic:nvPicPr>
+                          <pic:cNvPr id="0" name="financing.png"/>
+                          <pic:cNvPicPr/>
+                        </pic:nvPicPr>
+                        <pic:blipFill>
+                          <a:blip r:embed="rId15"/>
+                          <a:stretch>
+                            <a:fillRect/>
+                          </a:stretch>
+                        </pic:blipFill>
+                        <pic:spPr>
+                          <a:xfrm>
+                            <a:off x="0" y="0"/>
+                            <a:ext cx="5486400" cy="4876800"/>
+                          </a:xfrm>
+                          <a:prstGeom prst="rect"/>
+                        </pic:spPr>
+                      </pic:pic>
+                    </a:graphicData>
+                  </a:graphic>
+                </wp:inline>
               </w:drawing>
             </w:r>
           </w:p>
@@ -7887,40 +7887,40 @@
           </w:tcPr>
           <w:p>
             <w:pPr>
-              <w:jc val="center"/>
+              <w:jc w:val="center"/>
             </w:pPr>
             <w:r>
               <w:drawing>
-                <ns2:inline>
-                  <ns2:extent cx="5577840" cy="4958080"/>
-                  <ns2:docPr id="904" name="analysis.png" descr="analysis.png"/>
-                  <ns2:cNvGraphicFramePr>
-                    <ns3:graphicFrameLocks noChangeAspect="1"/>
-                  </ns2:cNvGraphicFramePr>
-                  <ns3:graphic>
-                    <ns3:graphicData uri="http://schemas.openxmlformats.org/drawingml/2006/picture">
-                      <ns4:pic>
-                        <ns4:nvPicPr>
-                          <ns4:cNvPr id="904" name="analysis.png" descr="analysis.png"/>
-                          <ns4:cNvPicPr/>
-                        </ns4:nvPicPr>
-                        <ns4:blipFill>
-                          <ns3:blip ns5:embed="rIdExecutionEvidence4"/>
-                          <ns3:stretch>
-                            <ns3:fillRect/>
-                          </ns3:stretch>
-                        </ns4:blipFill>
-                        <ns4:spPr>
-                          <ns3:xfrm>
-                            <ns3:off x="0" y="0"/>
-                            <ns3:ext cx="5577840" cy="4958080"/>
-                          </ns3:xfrm>
-                          <ns3:prstGeom prst="rect"/>
-                        </ns4:spPr>
-                      </ns4:pic>
-                    </ns3:graphicData>
-                  </ns3:graphic>
-                </ns2:inline>
+                <wp:inline xmlns:a="http://schemas.openxmlformats.org/drawingml/2006/main" xmlns:pic="http://schemas.openxmlformats.org/drawingml/2006/picture">
+                  <wp:extent cx="5486400" cy="4876800"/>
+                  <wp:docPr id="6" name="Picture 6"/>
+                  <wp:cNvGraphicFramePr>
+                    <a:graphicFrameLocks noChangeAspect="1"/>
+                  </wp:cNvGraphicFramePr>
+                  <a:graphic>
+                    <a:graphicData uri="http://schemas.openxmlformats.org/drawingml/2006/picture">
+                      <pic:pic>
+                        <pic:nvPicPr>
+                          <pic:cNvPr id="0" name="analysis.png"/>
+                          <pic:cNvPicPr/>
+                        </pic:nvPicPr>
+                        <pic:blipFill>
+                          <a:blip r:embed="rId16"/>
+                          <a:stretch>
+                            <a:fillRect/>
+                          </a:stretch>
+                        </pic:blipFill>
+                        <pic:spPr>
+                          <a:xfrm>
+                            <a:off x="0" y="0"/>
+                            <a:ext cx="5486400" cy="4876800"/>
+                          </a:xfrm>
+                          <a:prstGeom prst="rect"/>
+                        </pic:spPr>
+                      </pic:pic>
+                    </a:graphicData>
+                  </a:graphic>
+                </wp:inline>
               </w:drawing>
             </w:r>
           </w:p>
@@ -7985,40 +7985,40 @@
           </w:tcPr>
           <w:p>
             <w:pPr>
-              <w:jc val="center"/>
+              <w:jc w:val="center"/>
             </w:pPr>
             <w:r>
               <w:drawing>
-                <ns2:inline>
-                  <ns2:extent cx="5577840" cy="4287915"/>
-                  <ns2:docPr id="905" name="copilot.png" descr="copilot.png"/>
-                  <ns2:cNvGraphicFramePr>
-                    <ns3:graphicFrameLocks noChangeAspect="1"/>
-                  </ns2:cNvGraphicFramePr>
-                  <ns3:graphic>
-                    <ns3:graphicData uri="http://schemas.openxmlformats.org/drawingml/2006/picture">
-                      <ns4:pic>
-                        <ns4:nvPicPr>
-                          <ns4:cNvPr id="905" name="copilot.png" descr="copilot.png"/>
-                          <ns4:cNvPicPr/>
-                        </ns4:nvPicPr>
-                        <ns4:blipFill>
-                          <ns3:blip ns5:embed="rIdExecutionEvidence5"/>
-                          <ns3:stretch>
-                            <ns3:fillRect/>
-                          </ns3:stretch>
-                        </ns4:blipFill>
-                        <ns4:spPr>
-                          <ns3:xfrm>
-                            <ns3:off x="0" y="0"/>
-                            <ns3:ext cx="5577840" cy="4287915"/>
-                          </ns3:xfrm>
-                          <ns3:prstGeom prst="rect"/>
-                        </ns4:spPr>
-                      </ns4:pic>
-                    </ns3:graphicData>
-                  </ns3:graphic>
-                </ns2:inline>
+                <wp:inline xmlns:a="http://schemas.openxmlformats.org/drawingml/2006/main" xmlns:pic="http://schemas.openxmlformats.org/drawingml/2006/picture">
+                  <wp:extent cx="5486400" cy="4217621"/>
+                  <wp:docPr id="7" name="Picture 7"/>
+                  <wp:cNvGraphicFramePr>
+                    <a:graphicFrameLocks noChangeAspect="1"/>
+                  </wp:cNvGraphicFramePr>
+                  <a:graphic>
+                    <a:graphicData uri="http://schemas.openxmlformats.org/drawingml/2006/picture">
+                      <pic:pic>
+                        <pic:nvPicPr>
+                          <pic:cNvPr id="0" name="copilot.png"/>
+                          <pic:cNvPicPr/>
+                        </pic:nvPicPr>
+                        <pic:blipFill>
+                          <a:blip r:embed="rId17"/>
+                          <a:stretch>
+                            <a:fillRect/>
+                          </a:stretch>
+                        </pic:blipFill>
+                        <pic:spPr>
+                          <a:xfrm>
+                            <a:off x="0" y="0"/>
+                            <a:ext cx="5486400" cy="4217621"/>
+                          </a:xfrm>
+                          <a:prstGeom prst="rect"/>
+                        </pic:spPr>
+                      </pic:pic>
+                    </a:graphicData>
+                  </a:graphic>
+                </wp:inline>
               </w:drawing>
             </w:r>
           </w:p>
@@ -8083,40 +8083,40 @@
           </w:tcPr>
           <w:p>
             <w:pPr>
-              <w:jc val="center"/>
+              <w:jc w:val="center"/>
             </w:pPr>
             <w:r>
               <w:drawing>
-                <ns2:inline>
-                  <ns2:extent cx="5577840" cy="6430010"/>
-                  <ns2:docPr id="906" name="approvals-workflow.png" descr="approvals-workflow.png"/>
-                  <ns2:cNvGraphicFramePr>
-                    <ns3:graphicFrameLocks noChangeAspect="1"/>
-                  </ns2:cNvGraphicFramePr>
-                  <ns3:graphic>
-                    <ns3:graphicData uri="http://schemas.openxmlformats.org/drawingml/2006/picture">
-                      <ns4:pic>
-                        <ns4:nvPicPr>
-                          <ns4:cNvPr id="906" name="approvals-workflow.png" descr="approvals-workflow.png"/>
-                          <ns4:cNvPicPr/>
-                        </ns4:nvPicPr>
-                        <ns4:blipFill>
-                          <ns3:blip ns5:embed="rIdExecutionEvidence6"/>
-                          <ns3:stretch>
-                            <ns3:fillRect/>
-                          </ns3:stretch>
-                        </ns4:blipFill>
-                        <ns4:spPr>
-                          <ns3:xfrm>
-                            <ns3:off x="0" y="0"/>
-                            <ns3:ext cx="5577840" cy="6430010"/>
-                          </ns3:xfrm>
-                          <ns3:prstGeom prst="rect"/>
-                        </ns4:spPr>
-                      </ns4:pic>
-                    </ns3:graphicData>
-                  </ns3:graphic>
-                </ns2:inline>
+                <wp:inline xmlns:a="http://schemas.openxmlformats.org/drawingml/2006/main" xmlns:pic="http://schemas.openxmlformats.org/drawingml/2006/picture">
+                  <wp:extent cx="5486400" cy="6324600"/>
+                  <wp:docPr id="8" name="Picture 8"/>
+                  <wp:cNvGraphicFramePr>
+                    <a:graphicFrameLocks noChangeAspect="1"/>
+                  </wp:cNvGraphicFramePr>
+                  <a:graphic>
+                    <a:graphicData uri="http://schemas.openxmlformats.org/drawingml/2006/picture">
+                      <pic:pic>
+                        <pic:nvPicPr>
+                          <pic:cNvPr id="0" name="approvals-workflow.png"/>
+                          <pic:cNvPicPr/>
+                        </pic:nvPicPr>
+                        <pic:blipFill>
+                          <a:blip r:embed="rId18"/>
+                          <a:stretch>
+                            <a:fillRect/>
+                          </a:stretch>
+                        </pic:blipFill>
+                        <pic:spPr>
+                          <a:xfrm>
+                            <a:off x="0" y="0"/>
+                            <a:ext cx="5486400" cy="6324600"/>
+                          </a:xfrm>
+                          <a:prstGeom prst="rect"/>
+                        </pic:spPr>
+                      </pic:pic>
+                    </a:graphicData>
+                  </a:graphic>
+                </wp:inline>
               </w:drawing>
             </w:r>
           </w:p>
@@ -8181,40 +8181,40 @@
           </w:tcPr>
           <w:p>
             <w:pPr>
-              <w:jc val="center"/>
+              <w:jc w:val="center"/>
             </w:pPr>
             <w:r>
               <w:drawing>
-                <ns2:inline>
-                  <ns2:extent cx="5577840" cy="4958080"/>
-                  <ns2:docPr id="907" name="upload.png" descr="upload.png"/>
-                  <ns2:cNvGraphicFramePr>
-                    <ns3:graphicFrameLocks noChangeAspect="1"/>
-                  </ns2:cNvGraphicFramePr>
-                  <ns3:graphic>
-                    <ns3:graphicData uri="http://schemas.openxmlformats.org/drawingml/2006/picture">
-                      <ns4:pic>
-                        <ns4:nvPicPr>
-                          <ns4:cNvPr id="907" name="upload.png" descr="upload.png"/>
-                          <ns4:cNvPicPr/>
-                        </ns4:nvPicPr>
-                        <ns4:blipFill>
-                          <ns3:blip ns5:embed="rIdExecutionEvidence7"/>
-                          <ns3:stretch>
-                            <ns3:fillRect/>
-                          </ns3:stretch>
-                        </ns4:blipFill>
-                        <ns4:spPr>
-                          <ns3:xfrm>
-                            <ns3:off x="0" y="0"/>
-                            <ns3:ext cx="5577840" cy="4958080"/>
-                          </ns3:xfrm>
-                          <ns3:prstGeom prst="rect"/>
-                        </ns4:spPr>
-                      </ns4:pic>
-                    </ns3:graphicData>
-                  </ns3:graphic>
-                </ns2:inline>
+                <wp:inline xmlns:a="http://schemas.openxmlformats.org/drawingml/2006/main" xmlns:pic="http://schemas.openxmlformats.org/drawingml/2006/picture">
+                  <wp:extent cx="5486400" cy="4876800"/>
+                  <wp:docPr id="9" name="Picture 9"/>
+                  <wp:cNvGraphicFramePr>
+                    <a:graphicFrameLocks noChangeAspect="1"/>
+                  </wp:cNvGraphicFramePr>
+                  <a:graphic>
+                    <a:graphicData uri="http://schemas.openxmlformats.org/drawingml/2006/picture">
+                      <pic:pic>
+                        <pic:nvPicPr>
+                          <pic:cNvPr id="0" name="upload.png"/>
+                          <pic:cNvPicPr/>
+                        </pic:nvPicPr>
+                        <pic:blipFill>
+                          <a:blip r:embed="rId19"/>
+                          <a:stretch>
+                            <a:fillRect/>
+                          </a:stretch>
+                        </pic:blipFill>
+                        <pic:spPr>
+                          <a:xfrm>
+                            <a:off x="0" y="0"/>
+                            <a:ext cx="5486400" cy="4876800"/>
+                          </a:xfrm>
+                          <a:prstGeom prst="rect"/>
+                        </pic:spPr>
+                      </pic:pic>
+                    </a:graphicData>
+                  </a:graphic>
+                </wp:inline>
               </w:drawing>
             </w:r>
           </w:p>
@@ -8279,40 +8279,40 @@
           </w:tcPr>
           <w:p>
             <w:pPr>
-              <w:jc val="center"/>
+              <w:jc w:val="center"/>
             </w:pPr>
             <w:r>
               <w:drawing>
-                <ns2:inline>
-                  <ns2:extent cx="5577840" cy="4958080"/>
-                  <ns2:docPr id="908" name="security.png" descr="security.png"/>
-                  <ns2:cNvGraphicFramePr>
-                    <ns3:graphicFrameLocks noChangeAspect="1"/>
-                  </ns2:cNvGraphicFramePr>
-                  <ns3:graphic>
-                    <ns3:graphicData uri="http://schemas.openxmlformats.org/drawingml/2006/picture">
-                      <ns4:pic>
-                        <ns4:nvPicPr>
-                          <ns4:cNvPr id="908" name="security.png" descr="security.png"/>
-                          <ns4:cNvPicPr/>
-                        </ns4:nvPicPr>
-                        <ns4:blipFill>
-                          <ns3:blip ns5:embed="rIdExecutionEvidence8"/>
-                          <ns3:stretch>
-                            <ns3:fillRect/>
-                          </ns3:stretch>
-                        </ns4:blipFill>
-                        <ns4:spPr>
-                          <ns3:xfrm>
-                            <ns3:off x="0" y="0"/>
-                            <ns3:ext cx="5577840" cy="4958080"/>
-                          </ns3:xfrm>
-                          <ns3:prstGeom prst="rect"/>
-                        </ns4:spPr>
-                      </ns4:pic>
-                    </ns3:graphicData>
-                  </ns3:graphic>
-                </ns2:inline>
+                <wp:inline xmlns:a="http://schemas.openxmlformats.org/drawingml/2006/main" xmlns:pic="http://schemas.openxmlformats.org/drawingml/2006/picture">
+                  <wp:extent cx="5486400" cy="4876800"/>
+                  <wp:docPr id="10" name="Picture 10"/>
+                  <wp:cNvGraphicFramePr>
+                    <a:graphicFrameLocks noChangeAspect="1"/>
+                  </wp:cNvGraphicFramePr>
+                  <a:graphic>
+                    <a:graphicData uri="http://schemas.openxmlformats.org/drawingml/2006/picture">
+                      <pic:pic>
+                        <pic:nvPicPr>
+                          <pic:cNvPr id="0" name="security.png"/>
+                          <pic:cNvPicPr/>
+                        </pic:nvPicPr>
+                        <pic:blipFill>
+                          <a:blip r:embed="rId20"/>
+                          <a:stretch>
+                            <a:fillRect/>
+                          </a:stretch>
+                        </pic:blipFill>
+                        <pic:spPr>
+                          <a:xfrm>
+                            <a:off x="0" y="0"/>
+                            <a:ext cx="5486400" cy="4876800"/>
+                          </a:xfrm>
+                          <a:prstGeom prst="rect"/>
+                        </pic:spPr>
+                      </pic:pic>
+                    </a:graphicData>
+                  </a:graphic>
+                </wp:inline>
               </w:drawing>
             </w:r>
           </w:p>
@@ -8549,6 +8549,7 @@
                 <w:rFonts w:ascii="Times New Roman" w:hAnsi="Times New Roman" w:eastAsia="Times New Roman"/>
                 <w:sz w:val="24"/>
               </w:rPr>
+              <w:t>Present; embedded in report</w:t>
             </w:r>
             <w:r>
               <w:rPr>
@@ -8558,7 +8559,6 @@
                 <w:color w:val="183A35"/>
                 <w:sz w:val="24"/>
               </w:rPr>
-              <w:t>Present; embedded in report</w:t>
             </w:r>
           </w:p>
         </w:tc>
@@ -8659,6 +8659,7 @@
                 <w:rFonts w:ascii="Times New Roman" w:hAnsi="Times New Roman" w:eastAsia="Times New Roman"/>
                 <w:sz w:val="24"/>
               </w:rPr>
+              <w:t>Present; embedded in report</w:t>
             </w:r>
             <w:r>
               <w:rPr>
@@ -8668,7 +8669,6 @@
                 <w:color w:val="183A35"/>
                 <w:sz w:val="24"/>
               </w:rPr>
-              <w:t>Present; embedded in report</w:t>
             </w:r>
           </w:p>
         </w:tc>
@@ -8769,6 +8769,7 @@
                 <w:rFonts w:ascii="Times New Roman" w:hAnsi="Times New Roman" w:eastAsia="Times New Roman"/>
                 <w:sz w:val="24"/>
               </w:rPr>
+              <w:t>Present; embedded in report</w:t>
             </w:r>
             <w:r>
               <w:rPr>
@@ -8778,7 +8779,6 @@
                 <w:color w:val="183A35"/>
                 <w:sz w:val="24"/>
               </w:rPr>
-              <w:t>Present; embedded in report</w:t>
             </w:r>
           </w:p>
         </w:tc>
@@ -8879,6 +8879,7 @@
                 <w:rFonts w:ascii="Times New Roman" w:hAnsi="Times New Roman" w:eastAsia="Times New Roman"/>
                 <w:sz w:val="24"/>
               </w:rPr>
+              <w:t>Present; embedded in report</w:t>
             </w:r>
             <w:r>
               <w:rPr>
@@ -8888,7 +8889,6 @@
                 <w:color w:val="183A35"/>
                 <w:sz w:val="24"/>
               </w:rPr>
-              <w:t>Present; embedded in report</w:t>
             </w:r>
           </w:p>
         </w:tc>
@@ -8989,6 +8989,7 @@
                 <w:rFonts w:ascii="Times New Roman" w:hAnsi="Times New Roman" w:eastAsia="Times New Roman"/>
                 <w:sz w:val="24"/>
               </w:rPr>
+              <w:t>Present; embedded in report</w:t>
             </w:r>
             <w:r>
               <w:rPr>
@@ -8998,7 +8999,6 @@
                 <w:color w:val="183A35"/>
                 <w:sz w:val="24"/>
               </w:rPr>
-              <w:t>Present; embedded in report</w:t>
             </w:r>
           </w:p>
         </w:tc>
@@ -9099,6 +9099,7 @@
                 <w:rFonts w:ascii="Times New Roman" w:hAnsi="Times New Roman" w:eastAsia="Times New Roman"/>
                 <w:sz w:val="24"/>
               </w:rPr>
+              <w:t>Present; embedded in report</w:t>
             </w:r>
             <w:r>
               <w:rPr>
@@ -9108,7 +9109,6 @@
                 <w:color w:val="183A35"/>
                 <w:sz w:val="24"/>
               </w:rPr>
-              <w:t>Present; embedded in report</w:t>
             </w:r>
           </w:p>
         </w:tc>
@@ -9209,6 +9209,7 @@
                 <w:rFonts w:ascii="Times New Roman" w:hAnsi="Times New Roman" w:eastAsia="Times New Roman"/>
                 <w:sz w:val="24"/>
               </w:rPr>
+              <w:t>Present; embedded in report</w:t>
             </w:r>
             <w:r>
               <w:rPr>
@@ -9218,7 +9219,6 @@
                 <w:color w:val="183A35"/>
                 <w:sz w:val="24"/>
               </w:rPr>
-              <w:t>Present; embedded in report</w:t>
             </w:r>
           </w:p>
         </w:tc>
@@ -9319,6 +9319,7 @@
                 <w:rFonts w:ascii="Times New Roman" w:hAnsi="Times New Roman" w:eastAsia="Times New Roman"/>
                 <w:sz w:val="24"/>
               </w:rPr>
+              <w:t>Present; embedded in report</w:t>
             </w:r>
             <w:r>
               <w:rPr>
@@ -9328,7 +9329,6 @@
                 <w:color w:val="183A35"/>
                 <w:sz w:val="24"/>
               </w:rPr>
-              <w:t>Present; embedded in report</w:t>
             </w:r>
           </w:p>
         </w:tc>
@@ -11155,6 +11155,7 @@
                 <w:rFonts w:ascii="Times New Roman" w:hAnsi="Times New Roman" w:eastAsia="Times New Roman"/>
                 <w:sz w:val="24"/>
               </w:rPr>
+              <w:t>docs/img/*.png; evidence/t02-overview-review.png</w:t>
             </w:r>
             <w:r>
               <w:rPr>
@@ -11164,7 +11165,6 @@
                 <w:color w:val="183A35"/>
                 <w:sz w:val="24"/>
               </w:rPr>
-              <w:t>docs/img/*.png; evidence/t02-overview-review.png</w:t>
             </w:r>
           </w:p>
         </w:tc>
@@ -11191,6 +11191,7 @@
                 <w:rFonts w:ascii="Times New Roman" w:hAnsi="Times New Roman" w:eastAsia="Times New Roman"/>
                 <w:sz w:val="24"/>
               </w:rPr>
+              <w:t>Public and signed-in synthetic UI captures present; historical view kept separate</w:t>
             </w:r>
             <w:r>
               <w:rPr>
@@ -11200,7 +11201,6 @@
                 <w:color w:val="183A35"/>
                 <w:sz w:val="24"/>
               </w:rPr>
-              <w:t>Public and signed-in synthetic UI captures present; historical view kept separate</w:t>
             </w:r>
           </w:p>
         </w:tc>
@@ -11227,6 +11227,7 @@
                 <w:rFonts w:ascii="Times New Roman" w:hAnsi="Times New Roman" w:eastAsia="Times New Roman"/>
                 <w:sz w:val="24"/>
               </w:rPr>
+              <w:t>Present; 8 core views embedded in report</w:t>
             </w:r>
             <w:r>
               <w:rPr>
@@ -11236,7 +11237,6 @@
                 <w:color w:val="183A35"/>
                 <w:sz w:val="24"/>
               </w:rPr>
-              <w:t>Present; 8 core views embedded in report</w:t>
             </w:r>
           </w:p>
         </w:tc>
@@ -11337,6 +11337,7 @@
                 <w:rFonts w:ascii="Times New Roman" w:hAnsi="Times New Roman" w:eastAsia="Times New Roman"/>
                 <w:sz w:val="24"/>
               </w:rPr>
+              <w:t>Current evidence index, including log/video status</w:t>
             </w:r>
             <w:r>
               <w:rPr>
@@ -11346,7 +11347,6 @@
                 <w:color w:val="183A35"/>
                 <w:sz w:val="24"/>
               </w:rPr>
-              <w:t>Current evidence index, including log/video status</w:t>
             </w:r>
           </w:p>
         </w:tc>
@@ -11714,6 +11714,7 @@
                 <w:rFonts w:ascii="Times New Roman" w:hAnsi="Times New Roman" w:eastAsia="Times New Roman"/>
                 <w:sz w:val="24"/>
               </w:rPr>
+              <w:t>No other full-suite result is included in the reviewed artifacts.</w:t>
             </w:r>
             <w:r>
               <w:rPr>
@@ -11723,7 +11724,6 @@
                 <w:color w:val="183A35"/>
                 <w:sz w:val="24"/>
               </w:rPr>
-              <w:t>No other full-suite result is included in the reviewed artifacts.</w:t>
             </w:r>
           </w:p>
         </w:tc>
@@ -11974,6 +11974,7 @@
                 <w:rFonts w:ascii="Times New Roman" w:hAnsi="Times New Roman" w:eastAsia="Times New Roman"/>
                 <w:sz w:val="24"/>
               </w:rPr>
+              <w:t>Public Overview and selected signed-in synthetic-workflow screenshots are present.</w:t>
             </w:r>
             <w:r>
               <w:rPr>
@@ -11983,7 +11984,6 @@
                 <w:color w:val="183A35"/>
                 <w:sz w:val="24"/>
               </w:rPr>
-              <w:t>Public Overview and selected signed-in synthetic-workflow screenshots are present.</w:t>
             </w:r>
           </w:p>
         </w:tc>
@@ -12010,6 +12010,7 @@
                 <w:rFonts w:ascii="Times New Roman" w:hAnsi="Times New Roman" w:eastAsia="Times New Roman"/>
                 <w:sz w:val="24"/>
               </w:rPr>
+              <w:t>Every page was live-verified or a demo video is included.</w:t>
             </w:r>
             <w:r>
               <w:rPr>
@@ -12019,7 +12020,6 @@
                 <w:color w:val="183A35"/>
                 <w:sz w:val="24"/>
               </w:rPr>
-              <w:t>Every page was live-verified or a demo video is included.</w:t>
             </w:r>
           </w:p>
         </w:tc>
@@ -12048,6 +12048,7 @@
                 <w:rFonts w:ascii="Times New Roman" w:hAnsi="Times New Roman" w:eastAsia="Times New Roman"/>
                 <w:sz w:val="24"/>
               </w:rPr>
+              <w:t>The app describes a local-only simulation; scripted workflow evidence and UI captures are checked in.</w:t>
             </w:r>
             <w:r>
               <w:rPr>
@@ -12057,7 +12058,6 @@
                 <w:color w:val="183A35"/>
                 <w:sz w:val="24"/>
               </w:rPr>
-              <w:t>The app describes a local-only simulation; scripted workflow evidence and UI captures are checked in.</w:t>
             </w:r>
           </w:p>
         </w:tc>
@@ -12084,6 +12084,7 @@
                 <w:rFonts w:ascii="Times New Roman" w:hAnsi="Times New Roman" w:eastAsia="Times New Roman"/>
                 <w:sz w:val="24"/>
               </w:rPr>
+              <w:t>A runtime sandbox log or recorded demo video exists in this checkout.</w:t>
             </w:r>
             <w:r>
               <w:rPr>
@@ -12093,7 +12094,6 @@
                 <w:color w:val="183A35"/>
                 <w:sz w:val="24"/>
               </w:rPr>
-              <w:t>A runtime sandbox log or recorded demo video exists in this checkout.</w:t>
             </w:r>
           </w:p>
         </w:tc>
@@ -12277,8 +12277,8 @@
       </w:r>
     </w:p>
     <w:sectPr>
-      <w:headerReference w:type="default" ns5:id="rId9"/>
-      <w:footerReference w:type="default" ns5:id="rId10"/>
+      <w:headerReference w:type="default" r:id="rId9"/>
+      <w:footerReference w:type="default" r:id="rId10"/>
       <w:pgSz w:w="12240" w:h="15840"/>
       <w:pgMar w:top="979" w:right="1037" w:bottom="979" w:left="1037" w:header="720" w:footer="720" w:gutter="0"/>
       <w:cols w:space="720"/>

</xml_diff>